<commit_message>
Write full Methods section as prose; replace placeholder draft in merged manuscript
</commit_message>
<xml_diff>
--- a/docs/Manuscript_Trends_2026.docx
+++ b/docs/Manuscript_Trends_2026.docx
@@ -346,1217 +346,238 @@
       </w:r>
     </w:p>
     <w:p>
+      <w:pPr>
+        <w:pStyle w:val="Heading1"/>
+      </w:pPr>
       <w:r>
-        <w:t>Method Section</w:t>
-      </w:r>
-      <w:r>
-        <w:t xml:space="preserve"> Structure</w:t>
+        <w:rPr>
+          <w:sz w:val="24"/>
+        </w:rPr>
+        <w:t>3. Methods</w:t>
       </w:r>
     </w:p>
     <w:p>
       <w:pPr>
-        <w:pStyle w:val="ListParagraph"/>
-        <w:numPr>
-          <w:ilvl w:val="0"/>
-          <w:numId w:val="15"/>
-        </w:numPr>
-        <w:rPr>
-          <w:rFonts w:asciiTheme="majorHAnsi" w:eastAsiaTheme="majorEastAsia" w:hAnsiTheme="majorHAnsi" w:cstheme="majorBidi"/>
-          <w:color w:val="0F4761" w:themeColor="accent1" w:themeShade="BF"/>
-          <w:sz w:val="40"/>
-          <w:szCs w:val="40"/>
-        </w:rPr>
+        <w:pStyle w:val="Heading2"/>
       </w:pPr>
       <w:r>
         <w:rPr>
-          <w:rFonts w:asciiTheme="majorHAnsi" w:eastAsiaTheme="majorEastAsia" w:hAnsiTheme="majorHAnsi" w:cstheme="majorBidi"/>
-          <w:color w:val="0F4761" w:themeColor="accent1" w:themeShade="BF"/>
-          <w:sz w:val="40"/>
-          <w:szCs w:val="40"/>
+          <w:sz w:val="22"/>
         </w:rPr>
-        <w:t xml:space="preserve">Literature Review </w:t>
-      </w:r>
-      <w:r>
-        <w:t>Methods (&lt; 800)</w:t>
+        <w:t>3.1 Methodological overview</w:t>
       </w:r>
     </w:p>
     <w:p>
       <w:pPr>
-        <w:pStyle w:val="ListParagraph"/>
-        <w:numPr>
-          <w:ilvl w:val="1"/>
-          <w:numId w:val="15"/>
-        </w:numPr>
+        <w:spacing w:after="120"/>
+        <w:ind w:firstLine="0"/>
       </w:pPr>
       <w:r>
-        <w:t>1</w:t>
-      </w:r>
-      <w:r>
         <w:rPr>
-          <w:vertAlign w:val="superscript"/>
+          <w:rFonts w:ascii="Times New Roman" w:hAnsi="Times New Roman"/>
+          <w:sz w:val="22"/>
         </w:rPr>
-        <w:t>st</w:t>
-      </w:r>
-      <w:r>
-        <w:t xml:space="preserve"> search strategy Structured LR (for demonstration of </w:t>
-      </w:r>
-      <w:proofErr w:type="gramStart"/>
-      <w:r>
-        <w:t>a database</w:t>
-      </w:r>
-      <w:proofErr w:type="gramEnd"/>
-      <w:r>
-        <w:t xml:space="preserve"> construction)</w:t>
+        <w:t>This review combined elements of a structured literature review (SLR) and horizon scanning to identify and analyse drivers, trends, and weak signals shaping the future of fisheries. The SLR component provided a rigorous and transparent framework for reducing bias in the search, selection, and synthesis of literature (Bearman et al., 2012; Pati and Lorusso, 2017). The horizon scanning component guided the exploration of early indicators of change across the Social, Technological, Economic, Environmental, and Political (STEEP) domains, drawing on a constructivist notion of signal detection that treats weak signals as socially interpreted observations rather than objective facts about the future (Cuhls, 2020; Amanatidou et al., 2012). The integration of these two approaches is consistent with the multi-phase research design rationale described by Cresswell and Clark (2017), in which distinct methodological strategies address sequential research objectives within a single overarching inquiry.</w:t>
       </w:r>
     </w:p>
     <w:p>
       <w:pPr>
-        <w:numPr>
-          <w:ilvl w:val="2"/>
-          <w:numId w:val="15"/>
-        </w:numPr>
+        <w:spacing w:after="120"/>
+        <w:ind w:firstLine="0"/>
       </w:pPr>
       <w:r>
-        <w:t>Keyword search:</w:t>
+        <w:rPr>
+          <w:rFonts w:ascii="Times New Roman" w:hAnsi="Times New Roman"/>
+          <w:sz w:val="22"/>
+        </w:rPr>
+        <w:t>The review followed a three-step search strategy. Step 1 was a structured review of peer-reviewed academic literature addressing fisheries and futures studies. Step 2 was a manual search of cross-sectoral foresight publications to identify broader megatrends and drivers relevant to fisheries systems. Step 3 was an initial horizon scan for weak and emerging signals from grey literature and non-academic sources. Steps 1 and 2 were conducted simultaneously in August 2024; Step 3 constitutes an ongoing living document that is updated as new signals are identified. The overall search strategy followed PRISMA 2020 reporting guidelines (Page et al., 2021). A PRISMA flow diagram summarising search outcomes is provided in Figure 1.</w:t>
       </w:r>
     </w:p>
     <w:p>
       <w:pPr>
-        <w:numPr>
-          <w:ilvl w:val="3"/>
-          <w:numId w:val="15"/>
-        </w:numPr>
+        <w:pStyle w:val="Heading2"/>
       </w:pPr>
       <w:r>
-        <w:t>Future, Trend, Impact Analysis</w:t>
+        <w:rPr>
+          <w:sz w:val="22"/>
+        </w:rPr>
+        <w:t>3.2 Search strategy 1: peer-reviewed fisheries futures literature</w:t>
       </w:r>
     </w:p>
     <w:p>
       <w:pPr>
-        <w:numPr>
-          <w:ilvl w:val="3"/>
-          <w:numId w:val="15"/>
-        </w:numPr>
+        <w:spacing w:after="120"/>
+        <w:ind w:firstLine="0"/>
       </w:pPr>
       <w:r>
-        <w:t>Future studies, Fisheries Research</w:t>
+        <w:rPr>
+          <w:rFonts w:ascii="Times New Roman" w:hAnsi="Times New Roman"/>
+          <w:sz w:val="22"/>
+        </w:rPr>
+        <w:t>The purpose of the first search strategy was to compile and synthesise the existing peer-reviewed literature addressing future scenarios, impact analyses, and trend evaluations in fisheries research. The primary automated search was conducted via OpenAlex, a free and openly accessible academic database covering approximately 250 million scholarly works across all disciplines (Priem et al., 2022 [VERIFY]). Seven query strings were applied (Table 1), each retrieving up to 300 results from the OpenAlex API using the polite pool protocol. Search terms were constructed to capture literature at the intersection of futures studies methodologies and fisheries research, and were iteratively tested for recall and precision prior to the search date.</w:t>
       </w:r>
     </w:p>
     <w:p>
       <w:pPr>
-        <w:numPr>
-          <w:ilvl w:val="3"/>
-          <w:numId w:val="15"/>
-        </w:numPr>
+        <w:spacing w:after="80"/>
       </w:pPr>
       <w:r>
-        <w:t>Future, Fisheries, Scenarios</w:t>
+        <w:rPr>
+          <w:rFonts w:ascii="Times New Roman" w:hAnsi="Times New Roman"/>
+          <w:i/>
+          <w:sz w:val="20"/>
+        </w:rPr>
+        <w:t>[Author note: Insert Table 1 — search parameters — here.]</w:t>
       </w:r>
     </w:p>
     <w:p>
       <w:pPr>
-        <w:numPr>
-          <w:ilvl w:val="3"/>
-          <w:numId w:val="15"/>
-        </w:numPr>
+        <w:spacing w:after="120"/>
+        <w:ind w:firstLine="0"/>
       </w:pPr>
       <w:r>
-        <w:t>Future of Fisheries</w:t>
+        <w:rPr>
+          <w:rFonts w:ascii="Times New Roman" w:hAnsi="Times New Roman"/>
+          <w:sz w:val="22"/>
+        </w:rPr>
+        <w:t>The 2,100 retrieved records were deduplicated using exact DOI matching followed by fuzzy title comparison (threshold: 90% similarity using the RapidFuzz library), which removed 479 duplicate records and yielded 1,621 unique entries. These were screened at title and abstract level by the primary reviewer against the following inclusion criteria: (1) the publication explicitly addresses future scenarios, drivers, or trend analyses in the context of fisheries or marine capture fisheries; and (2) the publication employs a future-oriented analytical perspective — including scenario analysis, projections, foresight methods, or trend assessment — rather than a purely retrospective or descriptive approach. Publications were excluded if they: (1) were not related to fisheries or marine capture fisheries; (2) lacked a future-oriented perspective (e.g. retrospective stock assessments); or (3) addressed only biological population dynamics without reference to broader social, economic, or governance drivers. Following title and abstract screening, 901 records were excluded and 720 were retained as potentially eligible; these 720 candidates are pending full-text eligibility assessment and are not included in the quantitative analyses reported in Section 4.</w:t>
       </w:r>
     </w:p>
     <w:p>
       <w:pPr>
-        <w:numPr>
-          <w:ilvl w:val="3"/>
-          <w:numId w:val="15"/>
-        </w:numPr>
+        <w:spacing w:after="120"/>
+        <w:ind w:firstLine="0"/>
       </w:pPr>
       <w:r>
-        <w:t>Future Trends and Drivers, Fisheries</w:t>
+        <w:rPr>
+          <w:rFonts w:ascii="Times New Roman" w:hAnsi="Times New Roman"/>
+          <w:sz w:val="22"/>
+        </w:rPr>
+        <w:t>In parallel with the automated search, 60 publications were identified and included through manual database searching and citation tracking conducted by the primary reviewer. These 60 manually identified papers constitute the fisheries futures evidence base for the analyses reported in Sections 4.2 and 4.3.</w:t>
       </w:r>
     </w:p>
     <w:p>
       <w:pPr>
-        <w:numPr>
-          <w:ilvl w:val="3"/>
-          <w:numId w:val="15"/>
-        </w:numPr>
+        <w:pStyle w:val="Heading2"/>
       </w:pPr>
       <w:r>
-        <w:t>Megatrend, Impacts, Fisheries</w:t>
+        <w:rPr>
+          <w:sz w:val="22"/>
+        </w:rPr>
+        <w:t>3.3 Search strategy 2: cross-sectoral foresight publications</w:t>
       </w:r>
     </w:p>
     <w:p>
       <w:pPr>
-        <w:numPr>
-          <w:ilvl w:val="3"/>
-          <w:numId w:val="15"/>
-        </w:numPr>
+        <w:spacing w:after="120"/>
+        <w:ind w:firstLine="0"/>
       </w:pPr>
       <w:r>
-        <w:t>Exploring Megatrends</w:t>
+        <w:rPr>
+          <w:rFonts w:ascii="Times New Roman" w:hAnsi="Times New Roman"/>
+          <w:sz w:val="22"/>
+        </w:rPr>
+        <w:t>The second search strategy aimed to identify cross-sectoral drivers and megatrends from outside the fisheries-specific literature that may be consequential for fisheries systems over the medium to long term. Rather than a structured database search, this strategy employed a purposive manual scan of established megatrend foresight publications, conducted between 10 and 12 August 2024. Sources were selected on the basis of their institutional standing, citation prominence in the foresight literature, and coverage of global or multi-sectoral trends. The scan encompassed publications from major consultancy organisations (including PwC, KPMG, EY, and Deloitte), intergovernmental and governmental bodies (including the European Commission Joint Research Centre, the OECD, and national science and innovation agencies), and peer-reviewed academic journals addressing futures studies and megatrend analysis.</w:t>
       </w:r>
     </w:p>
     <w:p>
       <w:pPr>
-        <w:numPr>
-          <w:ilvl w:val="2"/>
-          <w:numId w:val="15"/>
-        </w:numPr>
+        <w:spacing w:after="120"/>
+        <w:ind w:firstLine="0"/>
       </w:pPr>
       <w:r>
-        <w:t>Exclusion:</w:t>
+        <w:rPr>
+          <w:rFonts w:ascii="Times New Roman" w:hAnsi="Times New Roman"/>
+          <w:sz w:val="22"/>
+        </w:rPr>
+        <w:t>For each source, individual trend or driver entries were extracted and recorded in the cross-sectoral megatrend database with standardised metadata: trend label, details, author, source, publication year, and source type. A total of 145 entries were retained across seven source type categories. Sources that addressed only a single narrow topic without a futures orientation, or that could not be reliably attributed to an identifiable institutional author, were excluded. No formal inter-rater reliability procedure was applied to this strategy; selection decisions were made by the primary reviewer and documented in the database comments field.</w:t>
       </w:r>
     </w:p>
     <w:p>
       <w:pPr>
-        <w:numPr>
-          <w:ilvl w:val="3"/>
-          <w:numId w:val="15"/>
-        </w:numPr>
+        <w:pStyle w:val="Heading2"/>
       </w:pPr>
       <w:r>
-        <w:t>Not Fisheries Related</w:t>
+        <w:rPr>
+          <w:sz w:val="22"/>
+        </w:rPr>
+        <w:t>3.4 Search strategy 3: weak and emerging signals</w:t>
       </w:r>
     </w:p>
     <w:p>
       <w:pPr>
-        <w:numPr>
-          <w:ilvl w:val="3"/>
-          <w:numId w:val="15"/>
-        </w:numPr>
+        <w:spacing w:after="120"/>
+        <w:ind w:firstLine="0"/>
       </w:pPr>
       <w:r>
-        <w:t>Not Future Studies</w:t>
+        <w:rPr>
+          <w:rFonts w:ascii="Times New Roman" w:hAnsi="Times New Roman"/>
+          <w:sz w:val="22"/>
+        </w:rPr>
+        <w:t>The third search strategy focused on identifying weak and emerging signals of change not yet prominent in formal academic or institutional literature. Following Hiltunen (2010) and Rossel (2021), weak signals are understood here as early, often ambiguous observations that, when interpreted through an appropriate analytical lens, may indicate incipient shifts in the conditions facing fisheries systems. This review adopts a constructivist position: signals are not objective facts about the future but are socially constructed sense-making hypotheses about nascent developments (Cuhls, 2020). Accordingly, signal identification relies on informed interpretive judgement rather than systematic database searching.</w:t>
       </w:r>
     </w:p>
     <w:p>
       <w:pPr>
-        <w:numPr>
-          <w:ilvl w:val="3"/>
-          <w:numId w:val="15"/>
-        </w:numPr>
+        <w:spacing w:after="120"/>
+        <w:ind w:firstLine="0"/>
       </w:pPr>
       <w:r>
-        <w:t>No trends (apart from fish population)</w:t>
+        <w:rPr>
+          <w:rFonts w:ascii="Times New Roman" w:hAnsi="Times New Roman"/>
+          <w:sz w:val="22"/>
+        </w:rPr>
+        <w:t>Signals were identified through a combination of targeted grey literature review and active monitoring of technology, policy, and industry news sources relevant to fisheries and adjacent sectors. Each signal was documented in the living signal database with standardised metadata including: signal description, contextual details, source, publication date, and a reviewer commentary on potential fisheries relevance. The signal database is explicitly designed as an ongoing, collaborative resource rather than a completed systematic search; entries reported in this review should be understood as illustrative of the types of early-stage changes warranting monitoring, rather than as a comprehensive inventory.</w:t>
       </w:r>
     </w:p>
     <w:p>
       <w:pPr>
-        <w:numPr>
-          <w:ilvl w:val="2"/>
-          <w:numId w:val="15"/>
-        </w:numPr>
+        <w:pStyle w:val="Heading2"/>
       </w:pPr>
       <w:r>
-        <w:t xml:space="preserve">Databases: </w:t>
+        <w:rPr>
+          <w:sz w:val="22"/>
+        </w:rPr>
+        <w:t>3.5 Thematic classification</w:t>
       </w:r>
     </w:p>
     <w:p>
       <w:pPr>
-        <w:numPr>
-          <w:ilvl w:val="3"/>
-          <w:numId w:val="15"/>
-        </w:numPr>
+        <w:spacing w:after="120"/>
+        <w:ind w:firstLine="0"/>
       </w:pPr>
       <w:r>
-        <w:t>Google Scholar</w:t>
+        <w:rPr>
+          <w:rFonts w:ascii="Times New Roman" w:hAnsi="Times New Roman"/>
+          <w:sz w:val="22"/>
+        </w:rPr>
+        <w:t>All entries in the megatrend and fisheries futures databases were thematically classified using the STEEP framework (Social, Technological, Economic, Environmental, Political). Classification was performed computationally using a keyword-matching algorithm implemented in Python (source code available at: github.com/tmrmn/TrendFish2026). The algorithm concatenated the available text fields for each entry (trend label, details, and paper title), converted the combined string to lowercase, and applied a first-match rule against pre-specified keyword lists for each STEEP category. Entries that matched no keyword in any category, or for which all text fields were empty, were assigned to a residual Other/Unclassified category. The keyword lists were refined iteratively to improve precision, including the addition of fisheries-specific terminology (e.g. 'fishery', 'fisher', 'aquaculture', 'trophic') not present in generic STEEP schemes, and the replacement of overly generic terms (e.g. 'nature', which matched 'changing nature of work') with more specific compound expressions (e.g. 'nature conservation', 'nature-based', 'natural resource'). Classification was not subject to formal inter-rater reliability testing; this is acknowledged as a methodological limitation in Section 5c.</w:t>
       </w:r>
     </w:p>
     <w:p>
       <w:pPr>
-        <w:numPr>
-          <w:ilvl w:val="3"/>
-          <w:numId w:val="15"/>
-        </w:numPr>
+        <w:spacing w:after="120"/>
+        <w:ind w:firstLine="0"/>
       </w:pPr>
       <w:r>
-        <w:t>Elicit/Semantic scholar</w:t>
-      </w:r>
-    </w:p>
-    <w:p>
-      <w:r>
-        <w:t>Search date:</w:t>
+        <w:rPr>
+          <w:rFonts w:ascii="Times New Roman" w:hAnsi="Times New Roman"/>
+          <w:sz w:val="22"/>
+        </w:rPr>
+        <w:t>The gap analysis reported in Section 4.2 compares the STEEP distribution of the cross-sectoral megatrend database with that of the fisheries futures literature, expressed as percentage-point differences. Percentages were calculated over all entries in each database, including the Other/Unclassified category in the denominator. Entries in the Other/Unclassified category were excluded from the profile chart (Figure 5) to enable a cleaner visual comparison of the five classifiable STEEP domains. All analyses were conducted in Python using the pandas and matplotlib libraries; code and data are openly available in the project repository.</w:t>
       </w:r>
     </w:p>
     <w:p>
       <w:pPr>
-        <w:numPr>
-          <w:ilvl w:val="1"/>
-          <w:numId w:val="15"/>
-        </w:numPr>
-      </w:pPr>
-      <w:r>
-        <w:t>2</w:t>
-      </w:r>
-      <w:r>
-        <w:rPr>
-          <w:vertAlign w:val="superscript"/>
-        </w:rPr>
-        <w:t>nd</w:t>
-      </w:r>
-      <w:r>
-        <w:t xml:space="preserve"> search strategy</w:t>
-      </w:r>
-    </w:p>
-    <w:p>
-      <w:pPr>
-        <w:numPr>
-          <w:ilvl w:val="2"/>
-          <w:numId w:val="15"/>
-        </w:numPr>
-      </w:pPr>
-      <w:r>
-        <w:t>Megatrends and Drivers not fishery related:</w:t>
-      </w:r>
-    </w:p>
-    <w:p>
-      <w:pPr>
-        <w:numPr>
-          <w:ilvl w:val="3"/>
-          <w:numId w:val="15"/>
-        </w:numPr>
-      </w:pPr>
-      <w:r>
-        <w:t xml:space="preserve">Search for publications of well-known </w:t>
-      </w:r>
-      <w:proofErr w:type="gramStart"/>
-      <w:r>
-        <w:t>outlet</w:t>
-      </w:r>
-      <w:proofErr w:type="gramEnd"/>
-      <w:r>
-        <w:t xml:space="preserve"> for megatrends</w:t>
-      </w:r>
-    </w:p>
-    <w:p>
-      <w:pPr>
-        <w:numPr>
-          <w:ilvl w:val="3"/>
-          <w:numId w:val="15"/>
-        </w:numPr>
-      </w:pPr>
-      <w:r>
-        <w:t xml:space="preserve">Add Risks on the horizon </w:t>
-      </w:r>
-      <w:hyperlink r:id="rId9" w:history="1">
-        <w:r>
-          <w:rPr>
-            <w:rStyle w:val="Hyperlink"/>
-          </w:rPr>
-          <w:t>https://publications.jrc.ec.europa.eu/repository/handle/JRC137493</w:t>
-        </w:r>
-      </w:hyperlink>
-    </w:p>
-    <w:p>
-      <w:pPr>
-        <w:pStyle w:val="ListParagraph"/>
-        <w:numPr>
-          <w:ilvl w:val="1"/>
-          <w:numId w:val="15"/>
-        </w:numPr>
-      </w:pPr>
-      <w:r>
-        <w:t>3</w:t>
-      </w:r>
-      <w:r>
-        <w:rPr>
-          <w:vertAlign w:val="superscript"/>
-        </w:rPr>
-        <w:t>rd</w:t>
-      </w:r>
-      <w:r>
-        <w:t xml:space="preserve"> </w:t>
-      </w:r>
-      <w:proofErr w:type="spellStart"/>
-      <w:r>
-        <w:t>seach</w:t>
-      </w:r>
-      <w:proofErr w:type="spellEnd"/>
-      <w:r>
-        <w:t xml:space="preserve"> strategy for signals.</w:t>
-      </w:r>
-    </w:p>
-    <w:p>
-      <w:pPr>
-        <w:numPr>
-          <w:ilvl w:val="0"/>
-          <w:numId w:val="3"/>
-        </w:numPr>
-      </w:pPr>
-      <w:r>
-        <w:t xml:space="preserve">sniffing the signals, new </w:t>
-      </w:r>
-      <w:proofErr w:type="spellStart"/>
-      <w:r>
-        <w:t>sarticles</w:t>
-      </w:r>
-      <w:proofErr w:type="spellEnd"/>
-      <w:r>
-        <w:t xml:space="preserve"> etc.</w:t>
-      </w:r>
-    </w:p>
-    <w:p>
-      <w:pPr>
-        <w:rPr>
-          <w:b/>
-          <w:bCs/>
-        </w:rPr>
+        <w:spacing w:after="80"/>
       </w:pPr>
       <w:r>
         <w:rPr>
-          <w:b/>
-          <w:bCs/>
+          <w:rFonts w:ascii="Times New Roman" w:hAnsi="Times New Roman"/>
+          <w:i/>
+          <w:sz w:val="20"/>
         </w:rPr>
-        <w:t>Introduction:</w:t>
-      </w:r>
-    </w:p>
-    <w:p>
-      <w:pPr>
-        <w:pStyle w:val="ListParagraph"/>
-        <w:numPr>
-          <w:ilvl w:val="0"/>
-          <w:numId w:val="2"/>
-        </w:numPr>
-        <w:rPr>
-          <w:b/>
-          <w:bCs/>
-        </w:rPr>
-      </w:pPr>
-      <w:r>
-        <w:rPr>
-          <w:b/>
-          <w:bCs/>
-        </w:rPr>
-        <w:t>multi-phase research designs are valuable for addressing incremental research questions that advance one research objective sequentially (Cresswell &amp; Clark, 2017).</w:t>
-      </w:r>
-    </w:p>
-    <w:p>
-      <w:pPr>
-        <w:rPr>
-          <w:b/>
-          <w:bCs/>
-        </w:rPr>
-      </w:pPr>
-      <w:r>
-        <w:rPr>
-          <w:b/>
-          <w:bCs/>
-        </w:rPr>
-        <w:t xml:space="preserve">Search strategy: </w:t>
-      </w:r>
-    </w:p>
-    <w:p>
-      <w:pPr>
-        <w:spacing w:before="240" w:after="240"/>
-      </w:pPr>
-      <w:r>
-        <w:rPr>
-          <w:rFonts w:ascii="Aptos" w:eastAsia="Aptos" w:hAnsi="Aptos" w:cs="Aptos"/>
-        </w:rPr>
-        <w:t xml:space="preserve">This systematic review combined elements of a structured literature review (SLR) and horizon scanning to identify and </w:t>
-      </w:r>
-      <w:proofErr w:type="spellStart"/>
-      <w:r>
-        <w:rPr>
-          <w:rFonts w:ascii="Aptos" w:eastAsia="Aptos" w:hAnsi="Aptos" w:cs="Aptos"/>
-        </w:rPr>
-        <w:t>analyse</w:t>
-      </w:r>
-      <w:proofErr w:type="spellEnd"/>
-      <w:r>
-        <w:rPr>
-          <w:rFonts w:ascii="Aptos" w:eastAsia="Aptos" w:hAnsi="Aptos" w:cs="Aptos"/>
-        </w:rPr>
-        <w:t xml:space="preserve"> trends, drivers, and weak signals shaping the future of fisheries. The SLR component provided a rigorous and transparent framework for reducing bias in the search, selection, and synthesis of literature (Bearman et al., 2012; Pati &amp; Lorusso, 2017), while the horizon scanning approach guided the exploration of early indicators of change across environmental, technological, economic, and social domains (</w:t>
-      </w:r>
-      <w:proofErr w:type="spellStart"/>
-      <w:r>
-        <w:rPr>
-          <w:rFonts w:ascii="Aptos" w:eastAsia="Aptos" w:hAnsi="Aptos" w:cs="Aptos"/>
-        </w:rPr>
-        <w:t>Cuhls</w:t>
-      </w:r>
-      <w:proofErr w:type="spellEnd"/>
-      <w:r>
-        <w:rPr>
-          <w:rFonts w:ascii="Aptos" w:eastAsia="Aptos" w:hAnsi="Aptos" w:cs="Aptos"/>
-        </w:rPr>
-        <w:t xml:space="preserve">, 2020; </w:t>
-      </w:r>
-      <w:proofErr w:type="spellStart"/>
-      <w:r>
-        <w:rPr>
-          <w:rFonts w:ascii="Aptos" w:eastAsia="Aptos" w:hAnsi="Aptos" w:cs="Aptos"/>
-        </w:rPr>
-        <w:t>Amanatidou</w:t>
-      </w:r>
-      <w:proofErr w:type="spellEnd"/>
-      <w:r>
-        <w:rPr>
-          <w:rFonts w:ascii="Aptos" w:eastAsia="Aptos" w:hAnsi="Aptos" w:cs="Aptos"/>
-        </w:rPr>
-        <w:t>, 2012).</w:t>
-      </w:r>
-    </w:p>
-    <w:p>
-      <w:pPr>
-        <w:spacing w:before="240" w:after="240"/>
-      </w:pPr>
-      <w:r>
-        <w:rPr>
-          <w:rFonts w:ascii="Aptos" w:eastAsia="Aptos" w:hAnsi="Aptos" w:cs="Aptos"/>
-        </w:rPr>
-        <w:t>The review followed a three-step search strategy: (1) a structured review of peer-reviewed academic literature related to fisheries and futures studies, (2) a search for cross-sectoral foresight publications to identify broader megatrends, and (3) a scan for weak and emerging signals from non-academic and grey literature. Searches were conducted across multiple databases and sources, focusing on publications addressing future scenarios, impact assessments, and trend analyses in fisheries.</w:t>
-      </w:r>
-    </w:p>
-    <w:p>
-      <w:pPr>
-        <w:spacing w:before="240" w:after="240"/>
-      </w:pPr>
-      <w:r>
-        <w:rPr>
-          <w:rFonts w:ascii="Aptos" w:eastAsia="Aptos" w:hAnsi="Aptos" w:cs="Aptos"/>
-        </w:rPr>
-        <w:t xml:space="preserve">The purpose of the first step, the </w:t>
-      </w:r>
-      <w:r>
-        <w:rPr>
-          <w:rFonts w:ascii="Aptos" w:eastAsia="Aptos" w:hAnsi="Aptos" w:cs="Aptos"/>
-          <w:b/>
-          <w:bCs/>
-        </w:rPr>
-        <w:t>structured review</w:t>
-      </w:r>
-      <w:r>
-        <w:rPr>
-          <w:rFonts w:ascii="Aptos" w:eastAsia="Aptos" w:hAnsi="Aptos" w:cs="Aptos"/>
-        </w:rPr>
-        <w:t xml:space="preserve">, was to collect and </w:t>
-      </w:r>
-      <w:proofErr w:type="spellStart"/>
-      <w:r>
-        <w:rPr>
-          <w:rFonts w:ascii="Aptos" w:eastAsia="Aptos" w:hAnsi="Aptos" w:cs="Aptos"/>
-        </w:rPr>
-        <w:t>synthesise</w:t>
-      </w:r>
-      <w:proofErr w:type="spellEnd"/>
-      <w:r>
-        <w:rPr>
-          <w:rFonts w:ascii="Aptos" w:eastAsia="Aptos" w:hAnsi="Aptos" w:cs="Aptos"/>
-        </w:rPr>
-        <w:t xml:space="preserve"> existing studies on future scenarios, impact analyses, and trend evaluations in fisheries research. This systematic search ensured that foundational foresight and futures literature specific to fisheries was comprehensively captured across multiple databases. All results were systematically screened and filtered for relevance to fisheries and emerging developments to build </w:t>
-      </w:r>
-      <w:proofErr w:type="gramStart"/>
-      <w:r>
-        <w:rPr>
-          <w:rFonts w:ascii="Aptos" w:eastAsia="Aptos" w:hAnsi="Aptos" w:cs="Aptos"/>
-        </w:rPr>
-        <w:t>a robust evidence</w:t>
-      </w:r>
-      <w:proofErr w:type="gramEnd"/>
-      <w:r>
-        <w:rPr>
-          <w:rFonts w:ascii="Aptos" w:eastAsia="Aptos" w:hAnsi="Aptos" w:cs="Aptos"/>
-        </w:rPr>
-        <w:t xml:space="preserve"> base for understanding future-oriented dynamics in the sector.</w:t>
-      </w:r>
-    </w:p>
-    <w:p>
-      <w:pPr>
-        <w:spacing w:before="240" w:after="240"/>
-      </w:pPr>
-      <w:r>
-        <w:rPr>
-          <w:rFonts w:ascii="Aptos" w:eastAsia="Aptos" w:hAnsi="Aptos" w:cs="Aptos"/>
-        </w:rPr>
-        <w:t>The second step aimed to identif</w:t>
-      </w:r>
-      <w:r>
-        <w:rPr>
-          <w:rFonts w:ascii="Aptos" w:eastAsia="Aptos" w:hAnsi="Aptos" w:cs="Aptos"/>
-          <w:b/>
-          <w:bCs/>
-        </w:rPr>
-        <w:t xml:space="preserve">y cross-sectoral forces </w:t>
-      </w:r>
-      <w:r>
-        <w:rPr>
-          <w:rFonts w:ascii="Aptos" w:eastAsia="Aptos" w:hAnsi="Aptos" w:cs="Aptos"/>
-        </w:rPr>
-        <w:t xml:space="preserve">outside the traditional fisheries literature that could influence the sector in the future. This strategy broadened the scope of the review to include megatrends and overarching drivers shaping marine resource use, management, and policy. Its purpose was to detect large-scale external factors such as climate change, technological innovation, demographic transitions, and geopolitical developments that may indirectly affect fisheries systems in the coming decades. To achieve this, the reviewers examined grey literature and major foresight publications </w:t>
-      </w:r>
-      <w:proofErr w:type="spellStart"/>
-      <w:r>
-        <w:rPr>
-          <w:rFonts w:ascii="Aptos" w:eastAsia="Aptos" w:hAnsi="Aptos" w:cs="Aptos"/>
-        </w:rPr>
-        <w:lastRenderedPageBreak/>
-        <w:t>analysing</w:t>
-      </w:r>
-      <w:proofErr w:type="spellEnd"/>
-      <w:r>
-        <w:rPr>
-          <w:rFonts w:ascii="Aptos" w:eastAsia="Aptos" w:hAnsi="Aptos" w:cs="Aptos"/>
-        </w:rPr>
-        <w:t xml:space="preserve"> global and regional trends. In practice, this involved scanning influential reports and assessments produced by government agencies, international </w:t>
-      </w:r>
-      <w:proofErr w:type="spellStart"/>
-      <w:r>
-        <w:rPr>
-          <w:rFonts w:ascii="Aptos" w:eastAsia="Aptos" w:hAnsi="Aptos" w:cs="Aptos"/>
-        </w:rPr>
-        <w:t>organisations</w:t>
-      </w:r>
-      <w:proofErr w:type="spellEnd"/>
-      <w:r>
-        <w:rPr>
-          <w:rFonts w:ascii="Aptos" w:eastAsia="Aptos" w:hAnsi="Aptos" w:cs="Aptos"/>
-        </w:rPr>
-        <w:t>, and think tanks that, although not primarily focused on fisheries, identify emerging issues relevant to environmental governance and natural resource management.</w:t>
-      </w:r>
-    </w:p>
-    <w:p>
-      <w:pPr>
-        <w:spacing w:before="240" w:after="240"/>
-      </w:pPr>
-      <w:r>
-        <w:rPr>
-          <w:rFonts w:ascii="Aptos" w:eastAsia="Aptos" w:hAnsi="Aptos" w:cs="Aptos"/>
-        </w:rPr>
-        <w:t>The third step focused on i</w:t>
-      </w:r>
-      <w:r>
-        <w:rPr>
-          <w:rFonts w:ascii="Aptos" w:eastAsia="Aptos" w:hAnsi="Aptos" w:cs="Aptos"/>
-          <w:b/>
-          <w:bCs/>
-        </w:rPr>
-        <w:t xml:space="preserve">dentifying weak </w:t>
-      </w:r>
-      <w:r>
-        <w:rPr>
-          <w:rFonts w:ascii="Aptos" w:eastAsia="Aptos" w:hAnsi="Aptos" w:cs="Aptos"/>
-          <w:b/>
-          <w:bCs/>
-        </w:rPr>
-        <w:t>and emerging</w:t>
-      </w:r>
-      <w:r>
-        <w:rPr>
-          <w:rFonts w:ascii="Aptos" w:eastAsia="Aptos" w:hAnsi="Aptos" w:cs="Aptos"/>
-          <w:b/>
-          <w:bCs/>
-        </w:rPr>
-        <w:t xml:space="preserve"> signals of change</w:t>
-      </w:r>
-      <w:r>
-        <w:rPr>
-          <w:rFonts w:ascii="Aptos" w:eastAsia="Aptos" w:hAnsi="Aptos" w:cs="Aptos"/>
-        </w:rPr>
-        <w:t xml:space="preserve"> that are not yet prominent in academic or institutional literature. Weak signals of change are defined as observations that alert the observer, who then interprets them as potential indicators of future developments. It is important to note that in complex systems there are no “signals from the future,” and even less weak or strong ones. Rather, attentiveness varies according to cognitive framing, making it more appropriate to speak of “disregarded seeds of change hypotheses.” In this context, the review adopts a constructivist notion of weak signals, aiming to expand perception to a broader range of phenomena and to establish a socially robust process of sense-making. </w:t>
-      </w:r>
-    </w:p>
-    <w:p>
-      <w:pPr>
-        <w:spacing w:before="240" w:after="240"/>
-        <w:rPr>
-          <w:rFonts w:ascii="Aptos" w:eastAsia="Aptos" w:hAnsi="Aptos" w:cs="Aptos"/>
-        </w:rPr>
-      </w:pPr>
-      <w:r>
-        <w:rPr>
-          <w:rFonts w:ascii="Aptos" w:eastAsia="Aptos" w:hAnsi="Aptos" w:cs="Aptos"/>
-        </w:rPr>
-        <w:t xml:space="preserve">### THIS WILL BE </w:t>
-      </w:r>
-      <w:proofErr w:type="gramStart"/>
-      <w:r>
-        <w:rPr>
-          <w:rFonts w:ascii="Aptos" w:eastAsia="Aptos" w:hAnsi="Aptos" w:cs="Aptos"/>
-        </w:rPr>
-        <w:t>A TABLE</w:t>
-      </w:r>
-      <w:proofErr w:type="gramEnd"/>
-    </w:p>
-    <w:p>
-      <w:pPr>
-        <w:pStyle w:val="ListParagraph"/>
-        <w:numPr>
-          <w:ilvl w:val="0"/>
-          <w:numId w:val="1"/>
-        </w:numPr>
-        <w:spacing w:before="240" w:after="240"/>
-        <w:rPr>
-          <w:rFonts w:ascii="Aptos" w:eastAsia="Aptos" w:hAnsi="Aptos" w:cs="Aptos"/>
-          <w:b/>
-          <w:bCs/>
-        </w:rPr>
-      </w:pPr>
-      <w:r>
-        <w:rPr>
-          <w:rFonts w:ascii="Aptos" w:eastAsia="Aptos" w:hAnsi="Aptos" w:cs="Aptos"/>
-          <w:b/>
-          <w:bCs/>
-        </w:rPr>
-        <w:t>Structured review of peer-reviewed academic literature related to fisheries and futures studies</w:t>
-      </w:r>
-    </w:p>
-    <w:p>
-      <w:r>
-        <w:rPr>
-          <w:b/>
-          <w:bCs/>
-        </w:rPr>
-        <w:t>Search Date:</w:t>
-      </w:r>
-      <w:r>
-        <w:t xml:space="preserve"> 10-12 August 2024</w:t>
-      </w:r>
-    </w:p>
-    <w:p>
-      <w:pPr>
-        <w:rPr>
-          <w:rFonts w:ascii="Aptos" w:eastAsia="Aptos" w:hAnsi="Aptos" w:cs="Aptos"/>
-        </w:rPr>
-      </w:pPr>
-      <w:r>
-        <w:rPr>
-          <w:b/>
-          <w:bCs/>
-        </w:rPr>
-        <w:t>Databases Searched</w:t>
-      </w:r>
-      <w:r>
-        <w:t>: Google Scholar, Elici</w:t>
-      </w:r>
-      <w:r>
-        <w:t>t</w:t>
-      </w:r>
-      <w:r>
-        <w:t>, Semantic Scholar</w:t>
-      </w:r>
-    </w:p>
-    <w:p>
-      <w:pPr>
-        <w:rPr>
-          <w:b/>
-          <w:bCs/>
-        </w:rPr>
-      </w:pPr>
-      <w:r>
-        <w:rPr>
-          <w:b/>
-          <w:bCs/>
-        </w:rPr>
-        <w:t xml:space="preserve">Search Keywords: </w:t>
-      </w:r>
-    </w:p>
-    <w:p>
-      <w:pPr>
-        <w:pStyle w:val="ListParagraph"/>
-        <w:numPr>
-          <w:ilvl w:val="0"/>
-          <w:numId w:val="9"/>
-        </w:numPr>
-      </w:pPr>
-      <w:r>
-        <w:t>“Future, Trend, Impact Analysis”</w:t>
-      </w:r>
-    </w:p>
-    <w:p>
-      <w:pPr>
-        <w:pStyle w:val="ListParagraph"/>
-        <w:numPr>
-          <w:ilvl w:val="0"/>
-          <w:numId w:val="9"/>
-        </w:numPr>
-      </w:pPr>
-      <w:r>
-        <w:t>“Future studies, Fisheries Research”</w:t>
-      </w:r>
-    </w:p>
-    <w:p>
-      <w:pPr>
-        <w:pStyle w:val="ListParagraph"/>
-        <w:numPr>
-          <w:ilvl w:val="0"/>
-          <w:numId w:val="9"/>
-        </w:numPr>
-      </w:pPr>
-      <w:r>
-        <w:t>“Future, Fisheries, Scenarios”</w:t>
-      </w:r>
-    </w:p>
-    <w:p>
-      <w:pPr>
-        <w:pStyle w:val="ListParagraph"/>
-        <w:numPr>
-          <w:ilvl w:val="0"/>
-          <w:numId w:val="9"/>
-        </w:numPr>
-      </w:pPr>
-      <w:r>
-        <w:t>“Future of Fisheries”</w:t>
-      </w:r>
-    </w:p>
-    <w:p>
-      <w:pPr>
-        <w:pStyle w:val="ListParagraph"/>
-        <w:numPr>
-          <w:ilvl w:val="0"/>
-          <w:numId w:val="9"/>
-        </w:numPr>
-      </w:pPr>
-      <w:r>
-        <w:t>“Future Trends and Drivers, Fisheries”</w:t>
-      </w:r>
-    </w:p>
-    <w:p>
-      <w:pPr>
-        <w:pStyle w:val="ListParagraph"/>
-        <w:numPr>
-          <w:ilvl w:val="0"/>
-          <w:numId w:val="9"/>
-        </w:numPr>
-      </w:pPr>
-      <w:r>
-        <w:t>“Megatrend, Impacts, Fisheries”</w:t>
-      </w:r>
-    </w:p>
-    <w:p>
-      <w:pPr>
-        <w:pStyle w:val="ListParagraph"/>
-        <w:numPr>
-          <w:ilvl w:val="0"/>
-          <w:numId w:val="9"/>
-        </w:numPr>
-      </w:pPr>
-      <w:r>
-        <w:t>“Exploring Megatrends”</w:t>
-      </w:r>
-    </w:p>
-    <w:p>
-      <w:pPr>
-        <w:rPr>
-          <w:b/>
-          <w:bCs/>
-        </w:rPr>
-      </w:pPr>
-      <w:r>
-        <w:rPr>
-          <w:b/>
-          <w:bCs/>
-        </w:rPr>
-        <w:t>Inclusion Criteria:</w:t>
-      </w:r>
-    </w:p>
-    <w:p>
-      <w:pPr>
-        <w:pStyle w:val="ListParagraph"/>
-        <w:numPr>
-          <w:ilvl w:val="0"/>
-          <w:numId w:val="10"/>
-        </w:numPr>
-      </w:pPr>
-      <w:r>
-        <w:t>Publications explicitly addressing future scenarios, drivers, or trend analyses in the context of fisheries</w:t>
-      </w:r>
-    </w:p>
-    <w:p>
-      <w:pPr>
-        <w:pStyle w:val="ListParagraph"/>
-        <w:numPr>
-          <w:ilvl w:val="0"/>
-          <w:numId w:val="10"/>
-        </w:numPr>
-      </w:pPr>
-      <w:r>
-        <w:t>Studies linking fisheries with broader socio-environmental or technological foresight</w:t>
-      </w:r>
-    </w:p>
-    <w:p>
-      <w:pPr>
-        <w:rPr>
-          <w:b/>
-          <w:bCs/>
-        </w:rPr>
-      </w:pPr>
-      <w:r>
-        <w:rPr>
-          <w:b/>
-          <w:bCs/>
-        </w:rPr>
-        <w:lastRenderedPageBreak/>
-        <w:t>Exclusion Criteria:</w:t>
-      </w:r>
-    </w:p>
-    <w:p>
-      <w:pPr>
-        <w:pStyle w:val="ListParagraph"/>
-        <w:numPr>
-          <w:ilvl w:val="0"/>
-          <w:numId w:val="11"/>
-        </w:numPr>
-      </w:pPr>
-      <w:r>
-        <w:t xml:space="preserve">Publications not related to </w:t>
-      </w:r>
-      <w:proofErr w:type="gramStart"/>
-      <w:r>
-        <w:t>fisheries</w:t>
-      </w:r>
-      <w:proofErr w:type="gramEnd"/>
-    </w:p>
-    <w:p>
-      <w:pPr>
-        <w:pStyle w:val="ListParagraph"/>
-        <w:numPr>
-          <w:ilvl w:val="0"/>
-          <w:numId w:val="11"/>
-        </w:numPr>
-      </w:pPr>
-      <w:r>
-        <w:t>Articles lacking a future-oriented perspective (e.g. retrospective analyses)</w:t>
-      </w:r>
-    </w:p>
-    <w:p>
-      <w:pPr>
-        <w:pStyle w:val="ListParagraph"/>
-        <w:numPr>
-          <w:ilvl w:val="0"/>
-          <w:numId w:val="11"/>
-        </w:numPr>
-      </w:pPr>
-      <w:r>
-        <w:t>Studies focused solely on biological trends (e.g. population dynamics) without discussion of broader drivers or trends</w:t>
-      </w:r>
-    </w:p>
-    <w:p>
-      <w:pPr>
-        <w:pStyle w:val="ListParagraph"/>
-        <w:numPr>
-          <w:ilvl w:val="0"/>
-          <w:numId w:val="1"/>
-        </w:numPr>
-        <w:rPr>
-          <w:rFonts w:ascii="Aptos" w:eastAsia="Aptos" w:hAnsi="Aptos" w:cs="Aptos"/>
-          <w:b/>
-          <w:bCs/>
-        </w:rPr>
-      </w:pPr>
-      <w:r>
-        <w:rPr>
-          <w:rFonts w:ascii="Aptos" w:eastAsia="Aptos" w:hAnsi="Aptos" w:cs="Aptos"/>
-          <w:b/>
-          <w:bCs/>
-        </w:rPr>
-        <w:t>S</w:t>
-      </w:r>
-      <w:r>
-        <w:rPr>
-          <w:rFonts w:ascii="Aptos" w:eastAsia="Aptos" w:hAnsi="Aptos" w:cs="Aptos"/>
-          <w:b/>
-          <w:bCs/>
-        </w:rPr>
-        <w:t>earch for cross-sectoral foresight publications to identify broader megatrends</w:t>
-      </w:r>
-    </w:p>
-    <w:p>
-      <w:r>
-        <w:rPr>
-          <w:b/>
-          <w:bCs/>
-        </w:rPr>
-        <w:t>Date:</w:t>
-      </w:r>
-      <w:r>
-        <w:t xml:space="preserve"> 10-12 August 2024</w:t>
-      </w:r>
-      <w:r>
-        <w:t xml:space="preserve"> </w:t>
-      </w:r>
-    </w:p>
-    <w:p>
-      <w:pPr>
-        <w:rPr>
-          <w:b/>
-          <w:bCs/>
-        </w:rPr>
-      </w:pPr>
-      <w:r>
-        <w:rPr>
-          <w:b/>
-          <w:bCs/>
-        </w:rPr>
-        <w:t>Search Tools:</w:t>
-      </w:r>
-    </w:p>
-    <w:p>
-      <w:pPr>
-        <w:pStyle w:val="ListParagraph"/>
-        <w:numPr>
-          <w:ilvl w:val="0"/>
-          <w:numId w:val="14"/>
-        </w:numPr>
-      </w:pPr>
-      <w:r>
-        <w:t>Manual search</w:t>
-      </w:r>
-      <w:r>
-        <w:t xml:space="preserve"> </w:t>
-      </w:r>
-      <w:r>
-        <w:t>for</w:t>
-      </w:r>
-      <w:r>
-        <w:t xml:space="preserve"> foresight reports using terms such as “megatrends,” “emerging risks,” and “foresight”</w:t>
-      </w:r>
-    </w:p>
-    <w:p>
-      <w:pPr>
-        <w:pStyle w:val="ListParagraph"/>
-        <w:numPr>
-          <w:ilvl w:val="0"/>
-          <w:numId w:val="14"/>
-        </w:numPr>
-      </w:pPr>
-      <w:r>
-        <w:t>Focus on identifying potential drivers across sectors including climate, technology, governance, and demographics</w:t>
-      </w:r>
-    </w:p>
-    <w:p>
-      <w:pPr>
-        <w:rPr>
-          <w:b/>
-          <w:bCs/>
-        </w:rPr>
-      </w:pPr>
-      <w:r>
-        <w:rPr>
-          <w:b/>
-          <w:bCs/>
-        </w:rPr>
-        <w:t>Sources:</w:t>
-      </w:r>
-    </w:p>
-    <w:p>
-      <w:pPr>
-        <w:pStyle w:val="ListParagraph"/>
-        <w:numPr>
-          <w:ilvl w:val="0"/>
-          <w:numId w:val="13"/>
-        </w:numPr>
-      </w:pPr>
-      <w:proofErr w:type="gramStart"/>
-      <w:r>
-        <w:t>Reviewed foresight</w:t>
-      </w:r>
-      <w:proofErr w:type="gramEnd"/>
-      <w:r>
-        <w:t xml:space="preserve"> publications and grey literature from reputable institutions</w:t>
-      </w:r>
-    </w:p>
-    <w:p>
-      <w:pPr>
-        <w:pStyle w:val="ListParagraph"/>
-        <w:numPr>
-          <w:ilvl w:val="1"/>
-          <w:numId w:val="13"/>
-        </w:numPr>
-      </w:pPr>
-      <w:r>
-        <w:t>Name sources from table</w:t>
-      </w:r>
-    </w:p>
-    <w:p>
-      <w:pPr>
-        <w:pStyle w:val="ListParagraph"/>
-        <w:numPr>
-          <w:ilvl w:val="2"/>
-          <w:numId w:val="13"/>
-        </w:numPr>
-      </w:pPr>
-      <w:r>
-        <w:rPr>
-          <w:i/>
-          <w:iCs/>
-        </w:rPr>
-        <w:t>Risks on the Horizon</w:t>
-      </w:r>
-      <w:r>
-        <w:t xml:space="preserve"> (2024)</w:t>
-      </w:r>
-      <w:r>
-        <w:tab/>
-      </w:r>
-    </w:p>
-    <w:p>
-      <w:pPr>
-        <w:pStyle w:val="ListParagraph"/>
-        <w:numPr>
-          <w:ilvl w:val="2"/>
-          <w:numId w:val="13"/>
-        </w:numPr>
-      </w:pPr>
-      <w:r>
-        <w:t>Joint Research Centre (JRC) of the European Commission</w:t>
-      </w:r>
-    </w:p>
-    <w:p>
-      <w:pPr>
-        <w:pStyle w:val="ListParagraph"/>
-        <w:numPr>
-          <w:ilvl w:val="2"/>
-          <w:numId w:val="13"/>
-        </w:numPr>
-      </w:pPr>
-      <w:proofErr w:type="spellStart"/>
-      <w:r>
-        <w:t>etc</w:t>
-      </w:r>
-      <w:proofErr w:type="spellEnd"/>
-    </w:p>
-    <w:p>
-      <w:pPr>
-        <w:pStyle w:val="ListParagraph"/>
-        <w:numPr>
-          <w:ilvl w:val="0"/>
-          <w:numId w:val="13"/>
-        </w:numPr>
-      </w:pPr>
-      <w:r>
-        <w:t>Focused on known sources of global or sectoral trend analysis</w:t>
-      </w:r>
-      <w:r>
-        <w:t xml:space="preserve"> companies</w:t>
-      </w:r>
-    </w:p>
-    <w:p>
-      <w:pPr>
-        <w:pStyle w:val="ListParagraph"/>
-        <w:numPr>
-          <w:ilvl w:val="1"/>
-          <w:numId w:val="13"/>
-        </w:numPr>
-      </w:pPr>
-      <w:r>
-        <w:t xml:space="preserve">Name sources: </w:t>
-      </w:r>
-    </w:p>
-    <w:p>
-      <w:pPr>
-        <w:pStyle w:val="ListParagraph"/>
-        <w:numPr>
-          <w:ilvl w:val="2"/>
-          <w:numId w:val="13"/>
-        </w:numPr>
-      </w:pPr>
-      <w:proofErr w:type="spellStart"/>
-      <w:r>
-        <w:rPr>
-          <w:i/>
-          <w:iCs/>
-        </w:rPr>
-        <w:t>E</w:t>
-      </w:r>
-      <w:r>
-        <w:rPr>
-          <w:i/>
-          <w:iCs/>
-        </w:rPr>
-        <w:t>tc</w:t>
-      </w:r>
-      <w:proofErr w:type="spellEnd"/>
-    </w:p>
-    <w:p>
-      <w:pPr>
-        <w:pStyle w:val="ListParagraph"/>
-        <w:numPr>
-          <w:ilvl w:val="0"/>
-          <w:numId w:val="1"/>
-        </w:numPr>
-        <w:rPr>
-          <w:rFonts w:ascii="Aptos" w:eastAsia="Aptos" w:hAnsi="Aptos" w:cs="Aptos"/>
-        </w:rPr>
-      </w:pPr>
-      <w:r>
-        <w:rPr>
-          <w:rFonts w:ascii="Aptos" w:eastAsia="Aptos" w:hAnsi="Aptos" w:cs="Aptos"/>
-        </w:rPr>
-        <w:t>i</w:t>
-      </w:r>
-      <w:r>
-        <w:rPr>
-          <w:rFonts w:ascii="Aptos" w:eastAsia="Aptos" w:hAnsi="Aptos" w:cs="Aptos"/>
-          <w:b/>
-          <w:bCs/>
-        </w:rPr>
-        <w:t>dentifying weak and emerging signals of change</w:t>
-      </w:r>
-    </w:p>
-    <w:p>
-      <w:pPr>
-        <w:spacing w:beforeAutospacing="1" w:afterAutospacing="1"/>
-      </w:pPr>
-      <w:r>
-        <w:rPr>
-          <w:rFonts w:ascii="Aptos" w:eastAsia="Aptos" w:hAnsi="Aptos" w:cs="Aptos"/>
-        </w:rPr>
-        <w:t>Identified signals were systematically documented with basic metadata, including source, date, and topic, and stored for further analysis. This approach complements the structured and grey literature reviews by capturing emerging developments and short-term signals that may not yet be represented in formal research or foresight studies.</w:t>
-      </w:r>
-    </w:p>
-    <w:p>
-      <w:pPr>
-        <w:rPr>
-          <w:b/>
-          <w:bCs/>
-        </w:rPr>
-      </w:pPr>
-      <w:r>
-        <w:rPr>
-          <w:b/>
-          <w:bCs/>
-        </w:rPr>
-        <w:lastRenderedPageBreak/>
-        <w:t>References:</w:t>
-      </w:r>
-    </w:p>
-    <w:p>
-      <w:proofErr w:type="spellStart"/>
-      <w:r>
-        <w:t>Cuhls</w:t>
-      </w:r>
-      <w:proofErr w:type="spellEnd"/>
-      <w:r>
-        <w:t>, K. E. (2020). Horizon Scanning in Foresight–Why Horizon Scanning is only a part of the game. Futures &amp; Foresight Science, 2(1), e23.</w:t>
-      </w:r>
-    </w:p>
-    <w:p>
-      <w:proofErr w:type="spellStart"/>
-      <w:r>
-        <w:t>Amanatidou</w:t>
-      </w:r>
-      <w:proofErr w:type="spellEnd"/>
-      <w:r>
-        <w:t xml:space="preserve">, E., Butter, M., Carabias, V., </w:t>
-      </w:r>
-      <w:proofErr w:type="spellStart"/>
-      <w:r>
-        <w:t>Könnölä</w:t>
-      </w:r>
-      <w:proofErr w:type="spellEnd"/>
-      <w:r>
-        <w:t xml:space="preserve">, T., Leis, M., Saritas, O., &amp; van </w:t>
-      </w:r>
-      <w:proofErr w:type="spellStart"/>
-      <w:r>
-        <w:t>Rij</w:t>
-      </w:r>
-      <w:proofErr w:type="spellEnd"/>
-      <w:r>
-        <w:t>, V. (2012). On concepts and methods in horizon scanning: Lessons from initiating policy dialogues on emerging issues. Science and Public Policy, 39(2), 208-221.</w:t>
+        <w:t>[Author note: Add the OpenAlex citation — Priem, J., Piwowar, H., and Orr, R. (2022). OpenAlex: A fully-open index of the world's research literature. arXiv:2205.01833. Verify before submission.]</w:t>
       </w:r>
     </w:p>
     <w:p>

</xml_diff>

<commit_message>
Add Section 2 Conceptual Background and update merged manuscript
- write_conceptual_background.py: generates Section 2 (~770 words) covering
  futures studies and horizon scanning (2.1), the driver/trend/megatrend/
  signal conceptual hierarchy with definitions (2.2), and the STEEP framework
  and its dual analytical function in this review (2.3)
- merge_manuscript.py: insert ConceptualBackground_Trends_2026.docx between
  Introduction and Methods in the source list
- docs/ConceptualBackground_Trends_2026.docx: generated Section 2 document
- docs/Manuscript_Trends_2026.docx: regenerated with all 7 sections (92 paragraphs)

Addresses reviewer major concern: Section 2 was referenced in the Introduction
but absent from the manuscript.

Co-Authored-By: Claude Sonnet 4.6 <noreply@anthropic.com>
</commit_message>
<xml_diff>
--- a/docs/Manuscript_Trends_2026.docx
+++ b/docs/Manuscript_Trends_2026.docx
@@ -88,6 +88,19 @@
           <w:sz w:val="16"/>
         </w:rPr>
         <w:t>── INTRODUCTION ──────────────────────────────────────</w:t>
+      </w:r>
+    </w:p>
+    <w:p>
+      <w:pPr>
+        <w:spacing w:before="240" w:after="80"/>
+      </w:pPr>
+      <w:r>
+        <w:rPr>
+          <w:b w:val="0"/>
+          <w:color w:val="999999"/>
+          <w:sz w:val="16"/>
+        </w:rPr>
+        <w:t>── CONCEPTUAL BACKGROUND ──────────────────────────────────────</w:t>
       </w:r>
     </w:p>
     <w:p>
@@ -343,6 +356,170 @@
           <w:sz w:val="22"/>
         </w:rPr>
         <w:t>The paper is structured as follows. Section 2 introduces the conceptual framework and key terminology. Section 3 describes the three-step search strategy and classification procedure. Section 4 presents the results organised by drivers, trends, and signals. Section 5 discusses the implications of the findings for researchers, educators, and policymakers, and identifies priorities for future work. Section 6 concludes.</w:t>
+      </w:r>
+    </w:p>
+    <w:p>
+      <w:pPr>
+        <w:spacing w:before="240" w:after="80"/>
+      </w:pPr>
+      <w:r>
+        <w:rPr>
+          <w:rFonts w:ascii="Times New Roman" w:hAnsi="Times New Roman"/>
+          <w:b/>
+          <w:sz w:val="24"/>
+        </w:rPr>
+        <w:t>2. Conceptual Background</w:t>
+      </w:r>
+    </w:p>
+    <w:p>
+      <w:pPr>
+        <w:spacing w:before="160" w:after="80"/>
+      </w:pPr>
+      <w:r>
+        <w:rPr>
+          <w:rFonts w:ascii="Times New Roman" w:hAnsi="Times New Roman"/>
+          <w:b/>
+          <w:sz w:val="22"/>
+        </w:rPr>
+        <w:t>2.1 Futures studies and horizon scanning</w:t>
+      </w:r>
+    </w:p>
+    <w:p>
+      <w:pPr>
+        <w:spacing w:after="120"/>
+        <w:ind w:firstLine="425"/>
+        <w:jc w:val="both"/>
+      </w:pPr>
+      <w:r>
+        <w:rPr>
+          <w:rFonts w:ascii="Times New Roman" w:hAnsi="Times New Roman"/>
+          <w:sz w:val="22"/>
+        </w:rPr>
+        <w:t>Futures studies is an interdisciplinary field concerned with the systematic exploration of possible, probable, and preferable futures (Bell, 2003). It encompasses a diverse repertoire of methods, including scenario analysis, Delphi surveys, trend extrapolation, causal layered analysis, and horizon scanning, each suited to different types of foresight question and different degrees of uncertainty. What unifies these approaches is a shared orientation towards the structured analysis of change over medium to long-term timescales, and a concern with making the implicit assumptions embedded in policy and planning decisions explicit and open to revision (Cuhls, 2020).</w:t>
+      </w:r>
+    </w:p>
+    <w:p>
+      <w:pPr>
+        <w:spacing w:after="120"/>
+        <w:ind w:firstLine="425"/>
+        <w:jc w:val="both"/>
+      </w:pPr>
+      <w:r>
+        <w:rPr>
+          <w:rFonts w:ascii="Times New Roman" w:hAnsi="Times New Roman"/>
+          <w:sz w:val="22"/>
+        </w:rPr>
+        <w:t>Horizon scanning is a specific form of futures inquiry focused on the systematic detection of early indicators of change — including emerging trends, novel technologies, and weak signals — that lie at or beyond the current frontier of public attention (Sutherland et al., 2011). Unlike scenario planning, which constructs coherent narratives about future states, horizon scanning is primarily concerned with monitoring the periphery of current knowledge for developments that may become significant over time. It has been applied across a range of policy domains — including public health (Fisher et al., 2016), biodiversity conservation (Sutherland and Woodroof, 2009), and food systems (Tàbara et al., 2017) — but remains comparatively underdeveloped in fisheries research.</w:t>
+      </w:r>
+    </w:p>
+    <w:p>
+      <w:pPr>
+        <w:spacing w:before="160" w:after="80"/>
+      </w:pPr>
+      <w:r>
+        <w:rPr>
+          <w:rFonts w:ascii="Times New Roman" w:hAnsi="Times New Roman"/>
+          <w:b/>
+          <w:sz w:val="22"/>
+        </w:rPr>
+        <w:t>2.2 Drivers, trends, megatrends, and weak signals</w:t>
+      </w:r>
+    </w:p>
+    <w:p>
+      <w:pPr>
+        <w:spacing w:after="120"/>
+        <w:ind w:firstLine="425"/>
+        <w:jc w:val="both"/>
+      </w:pPr>
+      <w:r>
+        <w:rPr>
+          <w:rFonts w:ascii="Times New Roman" w:hAnsi="Times New Roman"/>
+          <w:sz w:val="22"/>
+        </w:rPr>
+        <w:t>This review employs four conceptual categories to organise the evidence base, each representing a distinct scale and degree of certainty in the analysis of change. These categories are positioned along a spectrum from broad, well-established forces operating at civilisational scale, to early and uncertain signals at the margins of formal knowledge.</w:t>
+      </w:r>
+    </w:p>
+    <w:p>
+      <w:pPr>
+        <w:spacing w:after="120"/>
+        <w:ind w:firstLine="425"/>
+        <w:jc w:val="both"/>
+      </w:pPr>
+      <w:r>
+        <w:rPr>
+          <w:rFonts w:ascii="Times New Roman" w:hAnsi="Times New Roman"/>
+          <w:sz w:val="22"/>
+        </w:rPr>
+        <w:t>Drivers of change are the underlying forces or pressures that shift conditions within a system, often operating at scales beyond the immediate control of individual stakeholders but with direct consequences for how institutions, communities, and industries function (Vecchiato and Roveda, 2010). Drivers may be biophysical — such as ocean warming or nutrient loading — or socially constituted, such as regulatory change, market restructuring, or shifts in consumer preferences. They provide the causal substrate from which observable trends emerge.</w:t>
+      </w:r>
+    </w:p>
+    <w:p>
+      <w:pPr>
+        <w:spacing w:after="120"/>
+        <w:ind w:firstLine="425"/>
+        <w:jc w:val="both"/>
+      </w:pPr>
+      <w:r>
+        <w:rPr>
+          <w:rFonts w:ascii="Times New Roman" w:hAnsi="Times New Roman"/>
+          <w:sz w:val="22"/>
+        </w:rPr>
+        <w:t>Trends are widespread, directional changes that unfold over time and influence attitudes, policies, and economic activity at societal scale (Celi and Colombi, 2020). They represent the observable manifestation of underlying drivers, and are typically sustained over multi-year periods before becoming institutionally recognised. When trends operate at a global scale and over multi-decadal timescales — reshaping fundamental conditions across multiple sectors simultaneously — they are commonly described as megatrends: powerful forces expected to bring about significant transformations in societal or natural environments over a period of five to twenty or more years (Naisbitt, 1982; Hajkowicz, 2015). Megatrends are distinguished from ordinary trends by their breadth, duration, and the degree to which they cut across sectoral, disciplinary, and geographical boundaries.</w:t>
+      </w:r>
+    </w:p>
+    <w:p>
+      <w:pPr>
+        <w:spacing w:after="120"/>
+        <w:ind w:firstLine="425"/>
+        <w:jc w:val="both"/>
+      </w:pPr>
+      <w:r>
+        <w:rPr>
+          <w:rFonts w:ascii="Times New Roman" w:hAnsi="Times New Roman"/>
+          <w:sz w:val="22"/>
+        </w:rPr>
+        <w:t>Weak signals occupy the opposite end of the certainty spectrum. Following Hiltunen (2010) and Rossel (2021), weak signals are understood here as early, often ambiguous observations that, when interpreted through an appropriate analytical lens, may indicate incipient shifts in the conditions facing fisheries systems. They do not yet appear in formal datasets or policy agendas, and their eventual significance is uncertain; their value lies precisely in the advance notice they may provide to practitioners willing to engage with uncertainty constructively. This review adopts a constructivist position with respect to signal detection: signals are not objective facts about the future, but socially constructed sense-making hypotheses about nascent developments (Cuhls, 2020).</w:t>
+      </w:r>
+    </w:p>
+    <w:p>
+      <w:pPr>
+        <w:spacing w:before="160" w:after="80"/>
+      </w:pPr>
+      <w:r>
+        <w:rPr>
+          <w:rFonts w:ascii="Times New Roman" w:hAnsi="Times New Roman"/>
+          <w:b/>
+          <w:sz w:val="22"/>
+        </w:rPr>
+        <w:t>2.3 The STEEP framework</w:t>
+      </w:r>
+    </w:p>
+    <w:p>
+      <w:pPr>
+        <w:spacing w:after="120"/>
+        <w:ind w:firstLine="425"/>
+        <w:jc w:val="both"/>
+      </w:pPr>
+      <w:r>
+        <w:rPr>
+          <w:rFonts w:ascii="Times New Roman" w:hAnsi="Times New Roman"/>
+          <w:sz w:val="22"/>
+        </w:rPr>
+        <w:t>The STEEP framework — an acronym for Social, Technological, Economic, Environmental, and Political — is a widely used organising scheme in strategic foresight and environmental scanning (Aguilar, 1967; Morrison, 1992). It provides a structured vocabulary for categorising the domains from which drivers and trends emerge, and facilitates systematic comparison across different evidence bases. The framework has been applied in megatrend analyses across multiple sectors (Kalaitzi et al., 2020; Malik and Janowska, 2021) and in policy foresight processes at the European Commission (Knowledge4Policy, 2022) and national science agencies (Naughtin et al., 2022).</w:t>
+      </w:r>
+    </w:p>
+    <w:p>
+      <w:pPr>
+        <w:spacing w:after="120"/>
+        <w:ind w:firstLine="425"/>
+        <w:jc w:val="both"/>
+      </w:pPr>
+      <w:r>
+        <w:rPr>
+          <w:rFonts w:ascii="Times New Roman" w:hAnsi="Times New Roman"/>
+          <w:sz w:val="22"/>
+        </w:rPr>
+        <w:t>In this review, STEEP classification serves two analytical functions. First, it provides a common taxonomic basis for comparing the thematic coverage of the cross-sectoral megatrend literature with that of the fisheries-specific futures literature — enabling the identification of disciplinary gaps where fisheries research has systematically under-engaged with particular domains of change. Second, it structures the presentation of results in Section 4, organising drivers and trends by the domain from which they primarily originate. Classification was applied computationally using a keyword-matching algorithm (see Section 3.5), with entries that did not match any STEEP keyword retained in a residual Other/Unclassified category.</w:t>
       </w:r>
     </w:p>
     <w:p>

</xml_diff>

<commit_message>
Sync local data files to deployed version
- data/article_structure.json: article metadata and section structure
- data/sections.json: written section drafts
- docs/Manuscript_Trends_2026.docx: latest merged manuscript

Co-Authored-By: Claude Sonnet 4.6 <noreply@anthropic.com>
</commit_message>
<xml_diff>
--- a/docs/Manuscript_Trends_2026.docx
+++ b/docs/Manuscript_Trends_2026.docx
@@ -12,9 +12,7 @@
           <w:b/>
           <w:sz w:val="28"/>
         </w:rPr>
-        <w:t>Drivers, Trends, and Signals in Fisheries Research:</w:t>
-        <w:br/>
-        <w:t>A Structured Literature Review and Horizon Scan</w:t>
+        <w:t>Drivers, Trends, and Signals in Fisheries Research: A Structured Literature Review and Horizon Scan</w:t>
       </w:r>
     </w:p>
     <w:p>
@@ -28,9 +26,7 @@
         </w:rPr>
         <w:t>Timo Szczepanska</w:t>
         <w:br/>
-        <w:t>Norwegian College of Fishery Science</w:t>
-        <w:br/>
-        <w:t>UiT The Arctic University of Norway, Tromsø, Norway</w:t>
+        <w:t>Norwegian College of Fishery Science, UiT The Arctic University of Norway</w:t>
         <w:br/>
         <w:t>tsz000@uit.no</w:t>
         <w:br/>
@@ -39,7 +35,7 @@
     </w:p>
     <w:p>
       <w:pPr>
-        <w:spacing w:after="480"/>
+        <w:spacing w:after="240"/>
       </w:pPr>
       <w:r>
         <w:rPr>
@@ -66,104 +62,7 @@
     </w:p>
     <w:p>
       <w:pPr>
-        <w:spacing w:before="240" w:after="80"/>
-      </w:pPr>
-      <w:r>
-        <w:rPr>
-          <w:b w:val="0"/>
-          <w:color w:val="999999"/>
-          <w:sz w:val="16"/>
-        </w:rPr>
-        <w:t>── ABSTRACT ──────────────────────────────────────</w:t>
-      </w:r>
-    </w:p>
-    <w:p>
-      <w:pPr>
-        <w:spacing w:before="240" w:after="80"/>
-      </w:pPr>
-      <w:r>
-        <w:rPr>
-          <w:b w:val="0"/>
-          <w:color w:val="999999"/>
-          <w:sz w:val="16"/>
-        </w:rPr>
-        <w:t>── INTRODUCTION ──────────────────────────────────────</w:t>
-      </w:r>
-    </w:p>
-    <w:p>
-      <w:pPr>
-        <w:spacing w:before="240" w:after="80"/>
-      </w:pPr>
-      <w:r>
-        <w:rPr>
-          <w:b w:val="0"/>
-          <w:color w:val="999999"/>
-          <w:sz w:val="16"/>
-        </w:rPr>
-        <w:t>── CONCEPTUAL BACKGROUND ──────────────────────────────────────</w:t>
-      </w:r>
-    </w:p>
-    <w:p>
-      <w:pPr>
-        <w:spacing w:before="240" w:after="80"/>
-      </w:pPr>
-      <w:r>
-        <w:rPr>
-          <w:b w:val="0"/>
-          <w:color w:val="999999"/>
-          <w:sz w:val="16"/>
-        </w:rPr>
-        <w:t>── METHODS ──────────────────────────────────────</w:t>
-      </w:r>
-    </w:p>
-    <w:p>
-      <w:pPr>
-        <w:spacing w:before="240" w:after="80"/>
-      </w:pPr>
-      <w:r>
-        <w:rPr>
-          <w:b w:val="0"/>
-          <w:color w:val="999999"/>
-          <w:sz w:val="16"/>
-        </w:rPr>
-        <w:t>── RESULTS ──────────────────────────────────────</w:t>
-      </w:r>
-    </w:p>
-    <w:p>
-      <w:pPr>
-        <w:spacing w:before="240" w:after="80"/>
-      </w:pPr>
-      <w:r>
-        <w:rPr>
-          <w:b w:val="0"/>
-          <w:color w:val="999999"/>
-          <w:sz w:val="16"/>
-        </w:rPr>
-        <w:t>── DISCUSSION ──────────────────────────────────────</w:t>
-      </w:r>
-    </w:p>
-    <w:p>
-      <w:pPr>
-        <w:spacing w:before="240" w:after="80"/>
-      </w:pPr>
-      <w:r>
-        <w:rPr>
-          <w:b w:val="0"/>
-          <w:color w:val="999999"/>
-          <w:sz w:val="16"/>
-        </w:rPr>
-        <w:t>── CONCLUSIONS ──────────────────────────────────────</w:t>
-      </w:r>
-    </w:p>
-    <w:sectPr>
-      <w:pgSz w:w="12240" w:h="15840"/>
-      <w:pgMar w:top="1417" w:right="1701" w:bottom="1417" w:left="1701" w:header="720" w:footer="720" w:gutter="0"/>
-      <w:cols w:space="720"/>
-      <w:docGrid w:linePitch="360"/>
-    </w:sectPr>
-    <w:p>
-      <w:pPr>
-        <w:spacing w:after="240"/>
+        <w:spacing w:before="320" w:after="120"/>
       </w:pPr>
       <w:r>
         <w:rPr>
@@ -171,110 +70,101 @@
           <w:b/>
           <w:sz w:val="24"/>
         </w:rPr>
+        <w:t>Abstract</w:t>
+      </w:r>
+    </w:p>
+    <w:p>
+      <w:pPr>
+        <w:spacing w:after="120"/>
+        <w:ind w:firstLine="425"/>
+        <w:jc w:val="both"/>
+      </w:pPr>
+      <w:r>
+        <w:rPr>
+          <w:rFonts w:ascii="Times New Roman" w:hAnsi="Times New Roman"/>
+          <w:sz w:val="22"/>
+        </w:rPr>
         <w:t>Drivers, Trends, and Signals in Fisheries Research: A Structured Literature Review and Horizon Scan</w:t>
       </w:r>
     </w:p>
     <w:p>
       <w:pPr>
-        <w:spacing w:after="0"/>
+        <w:spacing w:after="120"/>
+        <w:ind w:firstLine="425"/>
+        <w:jc w:val="both"/>
+      </w:pPr>
+      <w:r>
+        <w:rPr>
+          <w:rFonts w:ascii="Times New Roman" w:hAnsi="Times New Roman"/>
+          <w:sz w:val="22"/>
+        </w:rPr>
+        <w:t>Background. Fisheries systems face an accelerating array of structural pressures, yet futures studies methodologies — including horizon scanning, megatrend analysis, and weak signal detection — remain comparatively underutilised in fisheries research relative to other sectors. Systematic knowledge of the drivers, trends, and signals shaping the future of fisheries is a prerequisite for proactive governance, adaptive management, and evidence-based education.</w:t>
+      </w:r>
+    </w:p>
+    <w:p>
+      <w:pPr>
+        <w:spacing w:after="120"/>
+        <w:ind w:firstLine="425"/>
+        <w:jc w:val="both"/>
+      </w:pPr>
+      <w:r>
+        <w:rPr>
+          <w:rFonts w:ascii="Times New Roman" w:hAnsi="Times New Roman"/>
+          <w:sz w:val="22"/>
+        </w:rPr>
+        <w:t>Methods. We conducted a three-step search strategy comprising: (1) a structured review of peer-reviewed fisheries futures literature (n = 60 sources after manual screening, with 720 additional candidate papers from an automated OpenAlex search pending full-text eligibility assessment); (2) a cross-sectoral scan of megatrend foresight publications (n = 145 sources); and (3) an initial horizon scan for weak and emerging signals (n = 1 formally documented entry). All sources were thematically classified using the STEEP framework (Social, Technological, Economic, Environmental, Political). The search strategy followed PRISMA 2020 reporting guidelines (Page et al., 2021).</w:t>
+      </w:r>
+    </w:p>
+    <w:p>
+      <w:pPr>
+        <w:spacing w:after="120"/>
+        <w:ind w:firstLine="425"/>
+        <w:jc w:val="both"/>
+      </w:pPr>
+      <w:r>
+        <w:rPr>
+          <w:rFonts w:ascii="Times New Roman" w:hAnsi="Times New Roman"/>
+          <w:sz w:val="22"/>
+        </w:rPr>
+        <w:t>Results. Across the cross-sectoral megatrend database, environmental and technological drivers were equally prominent (28% each), followed by economic (23%) and social (12%) drivers. In the fisheries-specific futures literature, the environmental domain was strongly dominant (53% of classified entries), whilst no entry was classified under the technological domain. The resulting technology gap of +28 percentage points represents the largest disciplinary discrepancy identified. Social and economic drivers were also substantially underrepresented in the fisheries literature relative to the cross-sectoral baseline (+11 and +15 percentage points respectively).</w:t>
+      </w:r>
+    </w:p>
+    <w:p>
+      <w:pPr>
+        <w:spacing w:after="120"/>
+        <w:ind w:firstLine="425"/>
+        <w:jc w:val="both"/>
+      </w:pPr>
+      <w:r>
+        <w:rPr>
+          <w:rFonts w:ascii="Times New Roman" w:hAnsi="Times New Roman"/>
+          <w:sz w:val="22"/>
+        </w:rPr>
+        <w:t>Conclusions. Fisheries futures research is characterised by a pronounced environmental framing that leaves technological, social, and economic drivers of change systematically underrepresented. This has implications for researchers — who should prioritise interdisciplinary foresight work on technological transformation in fisheries — for educators — who should incorporate futures literacy into fisheries science curricula — and for policymakers — who risk designing governance frameworks with an incomplete view of the forces shaping the sector. The structured database of drivers, trends, and signals introduced in this review is offered as a living resource for the research community.</w:t>
+      </w:r>
+    </w:p>
+    <w:p>
+      <w:pPr>
+        <w:spacing w:after="120"/>
+        <w:ind w:firstLine="425"/>
+        <w:jc w:val="both"/>
+      </w:pPr>
+      <w:r>
+        <w:rPr>
+          <w:rFonts w:ascii="Times New Roman" w:hAnsi="Times New Roman"/>
+          <w:sz w:val="22"/>
+        </w:rPr>
+        <w:t>Keywords. horizon scanning; megatrends; fisheries futures; STEEP framework; systematic literature review; weak signals; foresight</w:t>
+      </w:r>
+    </w:p>
+    <w:p>
+      <w:pPr>
+        <w:spacing w:before="320" w:after="120"/>
       </w:pPr>
       <w:r>
         <w:rPr>
           <w:rFonts w:ascii="Times New Roman" w:hAnsi="Times New Roman"/>
           <w:b/>
-          <w:sz w:val="22"/>
-        </w:rPr>
-        <w:t xml:space="preserve">Background. </w:t>
-      </w:r>
-      <w:r>
-        <w:rPr>
-          <w:rFonts w:ascii="Times New Roman" w:hAnsi="Times New Roman"/>
-        </w:rPr>
-        <w:t>Fisheries systems face an accelerating array of structural pressures, yet futures studies methodologies — including horizon scanning, megatrend analysis, and weak signal detection — remain comparatively underutilised in fisheries research relative to other sectors. Systematic knowledge of the drivers, trends, and signals shaping the future of fisheries is a prerequisite for proactive governance, adaptive management, and evidence-based education.</w:t>
-      </w:r>
-    </w:p>
-    <w:p>
-      <w:pPr>
-        <w:spacing w:after="0"/>
-      </w:pPr>
-      <w:r>
-        <w:rPr>
-          <w:rFonts w:ascii="Times New Roman" w:hAnsi="Times New Roman"/>
-          <w:b/>
-          <w:sz w:val="22"/>
-        </w:rPr>
-        <w:t xml:space="preserve">Methods. </w:t>
-      </w:r>
-      <w:r>
-        <w:rPr>
-          <w:rFonts w:ascii="Times New Roman" w:hAnsi="Times New Roman"/>
-        </w:rPr>
-        <w:t>We conducted a three-step search strategy comprising: (1) a structured review of peer-reviewed fisheries futures literature (n = 60 sources after manual screening, with 720 additional candidate papers from an automated OpenAlex search pending full-text eligibility assessment); (2) a cross-sectoral scan of megatrend foresight publications (n = 145 sources); and (3) an initial horizon scan for weak and emerging signals (n = 1 formally documented entry). All sources were thematically classified using the STEEP framework (Social, Technological, Economic, Environmental, Political). The search strategy followed PRISMA 2020 reporting guidelines (Page et al., 2021).</w:t>
-      </w:r>
-    </w:p>
-    <w:p>
-      <w:pPr>
-        <w:spacing w:after="0"/>
-      </w:pPr>
-      <w:r>
-        <w:rPr>
-          <w:rFonts w:ascii="Times New Roman" w:hAnsi="Times New Roman"/>
-          <w:b/>
-          <w:sz w:val="22"/>
-        </w:rPr>
-        <w:t xml:space="preserve">Results. </w:t>
-      </w:r>
-      <w:r>
-        <w:rPr>
-          <w:rFonts w:ascii="Times New Roman" w:hAnsi="Times New Roman"/>
-        </w:rPr>
-        <w:t>Across the cross-sectoral megatrend database, environmental and technological drivers were equally prominent (28% each), followed by economic (23%) and social (12%) drivers. In the fisheries-specific futures literature, the environmental domain was strongly dominant (53% of classified entries), whilst no entry was classified under the technological domain. The resulting technology gap of +28 percentage points represents the largest disciplinary discrepancy identified. Social and economic drivers were also substantially underrepresented in the fisheries literature relative to the cross-sectoral baseline (+11 and +15 percentage points respectively).</w:t>
-      </w:r>
-    </w:p>
-    <w:p>
-      <w:pPr>
-        <w:spacing w:after="0"/>
-      </w:pPr>
-      <w:r>
-        <w:rPr>
-          <w:rFonts w:ascii="Times New Roman" w:hAnsi="Times New Roman"/>
-          <w:b/>
-          <w:sz w:val="22"/>
-        </w:rPr>
-        <w:t xml:space="preserve">Conclusions. </w:t>
-      </w:r>
-      <w:r>
-        <w:rPr>
-          <w:rFonts w:ascii="Times New Roman" w:hAnsi="Times New Roman"/>
-        </w:rPr>
-        <w:t>Fisheries futures research is characterised by a pronounced environmental framing that leaves technological, social, and economic drivers of change systematically underrepresented. This has implications for researchers — who should prioritise interdisciplinary foresight work on technological transformation in fisheries — for educators — who should incorporate futures literacy into fisheries science curricula — and for policymakers — who risk designing governance frameworks with an incomplete view of the forces shaping the sector. The structured database of drivers, trends, and signals introduced in this review is offered as a living resource for the research community.</w:t>
-      </w:r>
-    </w:p>
-    <w:p>
-      <w:pPr>
-        <w:spacing w:after="240"/>
-      </w:pPr>
-      <w:r>
-        <w:rPr>
-          <w:rFonts w:ascii="Times New Roman" w:hAnsi="Times New Roman"/>
-          <w:b/>
-          <w:sz w:val="22"/>
-        </w:rPr>
-        <w:t xml:space="preserve">Keywords. </w:t>
-      </w:r>
-      <w:r>
-        <w:rPr>
-          <w:rFonts w:ascii="Times New Roman" w:hAnsi="Times New Roman"/>
-        </w:rPr>
-        <w:t>horizon scanning; megatrends; fisheries futures; STEEP framework; systematic literature review; weak signals; foresight</w:t>
-      </w:r>
-    </w:p>
-    <w:p>
-      <w:pPr>
-        <w:pStyle w:val="Heading1"/>
-      </w:pPr>
-      <w:r>
-        <w:rPr>
           <w:sz w:val="24"/>
         </w:rPr>
         <w:t>1. Introduction</w:t>
@@ -283,7 +173,8 @@
     <w:p>
       <w:pPr>
         <w:spacing w:after="120"/>
-        <w:ind w:firstLine="0"/>
+        <w:ind w:firstLine="425"/>
+        <w:jc w:val="both"/>
       </w:pPr>
       <w:r>
         <w:rPr>
@@ -296,20 +187,22 @@
     <w:p>
       <w:pPr>
         <w:spacing w:after="120"/>
-        <w:ind w:firstLine="0"/>
+        <w:ind w:firstLine="425"/>
+        <w:jc w:val="both"/>
       </w:pPr>
       <w:r>
         <w:rPr>
           <w:rFonts w:ascii="Times New Roman" w:hAnsi="Times New Roman"/>
           <w:sz w:val="22"/>
         </w:rPr>
-        <w:t>The futures studies field offers a repertoire of conceptual tools and methods for the structured analysis of change. Drivers of change are forces or factors that shift conditions within a system, often operating at scales beyond the immediate control of individual stakeholders, but with direct and sometimes rapid consequences for how institutions, communities, and businesses function (Vecchiato and Roveda, 2010). Trends are widespread, directional changes that unfold over time, influencing attitudes, policies, and economic activity at societal scale; they emerge as specific innovations or cultural shifts become broadly recognised and institutionalised (Celi and Colombi, 2020). When trends operate at a global scale and over multi-decadal timescales, they are commonly described as megatrends — powerful forces expected to bring about significant transformations in societal or natural environments over a period of five to twenty or more years (Naisbitt, 1982; Hajkowicz, 2015). Weak signals, by contrast, are early and often ambiguous indicators of potentially significant future changes: subtle, socially embedded observations that, when interpreted through an appropriate analytical lens, can alert practitioners to developments that do not yet register in formal datasets or policy agendas (Hiltunen, 2010; Rossel, 2021).</w:t>
+        <w:t>The futures studies field offers a repertoire of conceptual tools and methods for the structured analysis of change. trends , drivers, and signals are key components of strategic foresight used to understand, anticipate, and navigate future changes. Trends are widespread, directional changes that unfold over time, influencing attitudes, policies, and economic activity at societal scale; they emerge as specific innovations or cultural shifts become broadly recognised and institutionalised (Celi and Colombi, 2020). When trends operate at a global scale and over multi-decadal timescales, they are commonly described as megatrends — powerful forces expected to bring about significant transformations in societal or natural environments over a period of five to twenty or more years (Naisbitt, 1982; Hajkowicz, 2015). Drivers of change are forces or factors that shift conditions within a system, often operating at scales beyond the immediate control of individual stakeholders, but with direct and sometimes rapid consequences for how institutions, communities, and businesses function (Vecchiato and Roveda, 2010). Weak signals, by contrast, are early and often ambiguous indicators of potentially significant future changes: subtle, socially embedded observations that, when interpreted through an appropriate analytical lens, can alert practitioners to developments that do not yet register in formal datasets or policy agendas (Hiltunen, 2010; Rossel, 2021).</w:t>
       </w:r>
     </w:p>
     <w:p>
       <w:pPr>
         <w:spacing w:after="120"/>
-        <w:ind w:firstLine="0"/>
+        <w:ind w:firstLine="425"/>
+        <w:jc w:val="both"/>
       </w:pPr>
       <w:r>
         <w:rPr>
@@ -322,7 +215,8 @@
     <w:p>
       <w:pPr>
         <w:spacing w:after="120"/>
-        <w:ind w:firstLine="0"/>
+        <w:ind w:firstLine="425"/>
+        <w:jc w:val="both"/>
       </w:pPr>
       <w:r>
         <w:rPr>
@@ -335,7 +229,8 @@
     <w:p>
       <w:pPr>
         <w:spacing w:after="120"/>
-        <w:ind w:firstLine="0"/>
+        <w:ind w:firstLine="425"/>
+        <w:jc w:val="both"/>
       </w:pPr>
       <w:r>
         <w:rPr>
@@ -348,7 +243,8 @@
     <w:p>
       <w:pPr>
         <w:spacing w:after="120"/>
-        <w:ind w:firstLine="0"/>
+        <w:ind w:firstLine="425"/>
+        <w:jc w:val="both"/>
       </w:pPr>
       <w:r>
         <w:rPr>
@@ -360,7 +256,7 @@
     </w:p>
     <w:p>
       <w:pPr>
-        <w:spacing w:before="240" w:after="80"/>
+        <w:spacing w:before="320" w:after="120"/>
       </w:pPr>
       <w:r>
         <w:rPr>
@@ -373,12 +269,13 @@
     </w:p>
     <w:p>
       <w:pPr>
-        <w:spacing w:before="160" w:after="80"/>
+        <w:spacing w:after="120"/>
+        <w:ind w:firstLine="425"/>
+        <w:jc w:val="both"/>
       </w:pPr>
       <w:r>
         <w:rPr>
           <w:rFonts w:ascii="Times New Roman" w:hAnsi="Times New Roman"/>
-          <w:b/>
           <w:sz w:val="22"/>
         </w:rPr>
         <w:t>2.1 Futures studies and horizon scanning</w:t>
@@ -414,12 +311,13 @@
     </w:p>
     <w:p>
       <w:pPr>
-        <w:spacing w:before="160" w:after="80"/>
+        <w:spacing w:after="120"/>
+        <w:ind w:firstLine="425"/>
+        <w:jc w:val="both"/>
       </w:pPr>
       <w:r>
         <w:rPr>
           <w:rFonts w:ascii="Times New Roman" w:hAnsi="Times New Roman"/>
-          <w:b/>
           <w:sz w:val="22"/>
         </w:rPr>
         <w:t>2.2 Drivers, trends, megatrends, and weak signals</w:t>
@@ -483,12 +381,13 @@
     </w:p>
     <w:p>
       <w:pPr>
-        <w:spacing w:before="160" w:after="80"/>
+        <w:spacing w:after="120"/>
+        <w:ind w:firstLine="425"/>
+        <w:jc w:val="both"/>
       </w:pPr>
       <w:r>
         <w:rPr>
           <w:rFonts w:ascii="Times New Roman" w:hAnsi="Times New Roman"/>
-          <w:b/>
           <w:sz w:val="22"/>
         </w:rPr>
         <w:t>2.3 The STEEP framework</w:t>
@@ -524,10 +423,12 @@
     </w:p>
     <w:p>
       <w:pPr>
-        <w:pStyle w:val="Heading1"/>
+        <w:spacing w:before="320" w:after="120"/>
       </w:pPr>
       <w:r>
         <w:rPr>
+          <w:rFonts w:ascii="Times New Roman" w:hAnsi="Times New Roman"/>
+          <w:b/>
           <w:sz w:val="24"/>
         </w:rPr>
         <w:t>3. Methods</w:t>
@@ -535,10 +436,13 @@
     </w:p>
     <w:p>
       <w:pPr>
-        <w:pStyle w:val="Heading2"/>
+        <w:spacing w:after="120"/>
+        <w:ind w:firstLine="425"/>
+        <w:jc w:val="both"/>
       </w:pPr>
       <w:r>
         <w:rPr>
+          <w:rFonts w:ascii="Times New Roman" w:hAnsi="Times New Roman"/>
           <w:sz w:val="22"/>
         </w:rPr>
         <w:t>3.1 Methodological overview</w:t>
@@ -547,7 +451,8 @@
     <w:p>
       <w:pPr>
         <w:spacing w:after="120"/>
-        <w:ind w:firstLine="0"/>
+        <w:ind w:firstLine="425"/>
+        <w:jc w:val="both"/>
       </w:pPr>
       <w:r>
         <w:rPr>
@@ -560,7 +465,8 @@
     <w:p>
       <w:pPr>
         <w:spacing w:after="120"/>
-        <w:ind w:firstLine="0"/>
+        <w:ind w:firstLine="425"/>
+        <w:jc w:val="both"/>
       </w:pPr>
       <w:r>
         <w:rPr>
@@ -572,10 +478,13 @@
     </w:p>
     <w:p>
       <w:pPr>
-        <w:pStyle w:val="Heading2"/>
+        <w:spacing w:after="120"/>
+        <w:ind w:firstLine="425"/>
+        <w:jc w:val="both"/>
       </w:pPr>
       <w:r>
         <w:rPr>
+          <w:rFonts w:ascii="Times New Roman" w:hAnsi="Times New Roman"/>
           <w:sz w:val="22"/>
         </w:rPr>
         <w:t>3.2 Search strategy 1: peer-reviewed fisheries futures literature</w:t>
@@ -584,7 +493,8 @@
     <w:p>
       <w:pPr>
         <w:spacing w:after="120"/>
-        <w:ind w:firstLine="0"/>
+        <w:ind w:firstLine="425"/>
+        <w:jc w:val="both"/>
       </w:pPr>
       <w:r>
         <w:rPr>
@@ -596,13 +506,14 @@
     </w:p>
     <w:p>
       <w:pPr>
-        <w:spacing w:after="80"/>
+        <w:spacing w:after="120"/>
+        <w:ind w:firstLine="425"/>
+        <w:jc w:val="both"/>
       </w:pPr>
       <w:r>
         <w:rPr>
           <w:rFonts w:ascii="Times New Roman" w:hAnsi="Times New Roman"/>
-          <w:i/>
-          <w:sz w:val="20"/>
+          <w:sz w:val="22"/>
         </w:rPr>
         <w:t>[Author note: Insert Table 1 — search parameters — here.]</w:t>
       </w:r>
@@ -610,7 +521,8 @@
     <w:p>
       <w:pPr>
         <w:spacing w:after="120"/>
-        <w:ind w:firstLine="0"/>
+        <w:ind w:firstLine="425"/>
+        <w:jc w:val="both"/>
       </w:pPr>
       <w:r>
         <w:rPr>
@@ -623,7 +535,8 @@
     <w:p>
       <w:pPr>
         <w:spacing w:after="120"/>
-        <w:ind w:firstLine="0"/>
+        <w:ind w:firstLine="425"/>
+        <w:jc w:val="both"/>
       </w:pPr>
       <w:r>
         <w:rPr>
@@ -635,10 +548,13 @@
     </w:p>
     <w:p>
       <w:pPr>
-        <w:pStyle w:val="Heading2"/>
+        <w:spacing w:after="120"/>
+        <w:ind w:firstLine="425"/>
+        <w:jc w:val="both"/>
       </w:pPr>
       <w:r>
         <w:rPr>
+          <w:rFonts w:ascii="Times New Roman" w:hAnsi="Times New Roman"/>
           <w:sz w:val="22"/>
         </w:rPr>
         <w:t>3.3 Search strategy 2: cross-sectoral foresight publications</w:t>
@@ -647,7 +563,8 @@
     <w:p>
       <w:pPr>
         <w:spacing w:after="120"/>
-        <w:ind w:firstLine="0"/>
+        <w:ind w:firstLine="425"/>
+        <w:jc w:val="both"/>
       </w:pPr>
       <w:r>
         <w:rPr>
@@ -660,7 +577,8 @@
     <w:p>
       <w:pPr>
         <w:spacing w:after="120"/>
-        <w:ind w:firstLine="0"/>
+        <w:ind w:firstLine="425"/>
+        <w:jc w:val="both"/>
       </w:pPr>
       <w:r>
         <w:rPr>
@@ -672,10 +590,13 @@
     </w:p>
     <w:p>
       <w:pPr>
-        <w:pStyle w:val="Heading2"/>
+        <w:spacing w:after="120"/>
+        <w:ind w:firstLine="425"/>
+        <w:jc w:val="both"/>
       </w:pPr>
       <w:r>
         <w:rPr>
+          <w:rFonts w:ascii="Times New Roman" w:hAnsi="Times New Roman"/>
           <w:sz w:val="22"/>
         </w:rPr>
         <w:t>3.4 Search strategy 3: weak and emerging signals</w:t>
@@ -684,7 +605,8 @@
     <w:p>
       <w:pPr>
         <w:spacing w:after="120"/>
-        <w:ind w:firstLine="0"/>
+        <w:ind w:firstLine="425"/>
+        <w:jc w:val="both"/>
       </w:pPr>
       <w:r>
         <w:rPr>
@@ -697,7 +619,8 @@
     <w:p>
       <w:pPr>
         <w:spacing w:after="120"/>
-        <w:ind w:firstLine="0"/>
+        <w:ind w:firstLine="425"/>
+        <w:jc w:val="both"/>
       </w:pPr>
       <w:r>
         <w:rPr>
@@ -709,10 +632,13 @@
     </w:p>
     <w:p>
       <w:pPr>
-        <w:pStyle w:val="Heading2"/>
+        <w:spacing w:after="120"/>
+        <w:ind w:firstLine="425"/>
+        <w:jc w:val="both"/>
       </w:pPr>
       <w:r>
         <w:rPr>
+          <w:rFonts w:ascii="Times New Roman" w:hAnsi="Times New Roman"/>
           <w:sz w:val="22"/>
         </w:rPr>
         <w:t>3.5 Thematic classification</w:t>
@@ -721,7 +647,8 @@
     <w:p>
       <w:pPr>
         <w:spacing w:after="120"/>
-        <w:ind w:firstLine="0"/>
+        <w:ind w:firstLine="425"/>
+        <w:jc w:val="both"/>
       </w:pPr>
       <w:r>
         <w:rPr>
@@ -734,7 +661,8 @@
     <w:p>
       <w:pPr>
         <w:spacing w:after="120"/>
-        <w:ind w:firstLine="0"/>
+        <w:ind w:firstLine="425"/>
+        <w:jc w:val="both"/>
       </w:pPr>
       <w:r>
         <w:rPr>
@@ -746,23 +674,26 @@
     </w:p>
     <w:p>
       <w:pPr>
-        <w:spacing w:after="80"/>
+        <w:spacing w:after="120"/>
+        <w:ind w:firstLine="425"/>
+        <w:jc w:val="both"/>
       </w:pPr>
       <w:r>
         <w:rPr>
           <w:rFonts w:ascii="Times New Roman" w:hAnsi="Times New Roman"/>
-          <w:i/>
-          <w:sz w:val="20"/>
+          <w:sz w:val="22"/>
         </w:rPr>
         <w:t>[Author note: Add the OpenAlex citation — Priem, J., Piwowar, H., and Orr, R. (2022). OpenAlex: A fully-open index of the world's research literature. arXiv:2205.01833. Verify before submission.]</w:t>
       </w:r>
     </w:p>
     <w:p>
       <w:pPr>
-        <w:pStyle w:val="Heading1"/>
+        <w:spacing w:before="320" w:after="120"/>
       </w:pPr>
       <w:r>
         <w:rPr>
+          <w:rFonts w:ascii="Times New Roman" w:hAnsi="Times New Roman"/>
+          <w:b/>
           <w:sz w:val="24"/>
         </w:rPr>
         <w:t>4. Results</w:t>
@@ -770,10 +701,13 @@
     </w:p>
     <w:p>
       <w:pPr>
-        <w:pStyle w:val="Heading2"/>
+        <w:spacing w:after="120"/>
+        <w:ind w:firstLine="425"/>
+        <w:jc w:val="both"/>
       </w:pPr>
       <w:r>
         <w:rPr>
+          <w:rFonts w:ascii="Times New Roman" w:hAnsi="Times New Roman"/>
           <w:sz w:val="22"/>
         </w:rPr>
         <w:t>4.1 Overview of search outcomes</w:t>
@@ -782,7 +716,8 @@
     <w:p>
       <w:pPr>
         <w:spacing w:after="120"/>
-        <w:ind w:firstLine="0"/>
+        <w:ind w:firstLine="425"/>
+        <w:jc w:val="both"/>
       </w:pPr>
       <w:r>
         <w:rPr>
@@ -795,7 +730,8 @@
     <w:p>
       <w:pPr>
         <w:spacing w:after="120"/>
-        <w:ind w:firstLine="0"/>
+        <w:ind w:firstLine="425"/>
+        <w:jc w:val="both"/>
       </w:pPr>
       <w:r>
         <w:rPr>
@@ -807,23 +743,27 @@
     </w:p>
     <w:p>
       <w:pPr>
-        <w:spacing w:after="80"/>
+        <w:spacing w:after="120"/>
+        <w:ind w:firstLine="425"/>
+        <w:jc w:val="both"/>
       </w:pPr>
       <w:r>
         <w:rPr>
           <w:rFonts w:ascii="Times New Roman" w:hAnsi="Times New Roman"/>
-          <w:i/>
-          <w:sz w:val="20"/>
+          <w:sz w:val="22"/>
         </w:rPr>
         <w:t>[Author note: Insert Table 1 — PRISMA flow counts — and Figures 1–3 here. Figures generated in search_output/figures/.]</w:t>
       </w:r>
     </w:p>
     <w:p>
       <w:pPr>
-        <w:pStyle w:val="Heading2"/>
+        <w:spacing w:after="120"/>
+        <w:ind w:firstLine="425"/>
+        <w:jc w:val="both"/>
       </w:pPr>
       <w:r>
         <w:rPr>
+          <w:rFonts w:ascii="Times New Roman" w:hAnsi="Times New Roman"/>
           <w:sz w:val="22"/>
         </w:rPr>
         <w:t>4.2 Drivers</w:t>
@@ -832,7 +772,8 @@
     <w:p>
       <w:pPr>
         <w:spacing w:after="120"/>
-        <w:ind w:firstLine="0"/>
+        <w:ind w:firstLine="425"/>
+        <w:jc w:val="both"/>
       </w:pPr>
       <w:r>
         <w:rPr>
@@ -845,7 +786,8 @@
     <w:p>
       <w:pPr>
         <w:spacing w:after="120"/>
-        <w:ind w:firstLine="0"/>
+        <w:ind w:firstLine="425"/>
+        <w:jc w:val="both"/>
       </w:pPr>
       <w:r>
         <w:rPr>
@@ -858,7 +800,8 @@
     <w:p>
       <w:pPr>
         <w:spacing w:after="120"/>
-        <w:ind w:firstLine="0"/>
+        <w:ind w:firstLine="425"/>
+        <w:jc w:val="both"/>
       </w:pPr>
       <w:r>
         <w:rPr>
@@ -870,10 +813,13 @@
     </w:p>
     <w:p>
       <w:pPr>
-        <w:pStyle w:val="Heading2"/>
+        <w:spacing w:after="120"/>
+        <w:ind w:firstLine="425"/>
+        <w:jc w:val="both"/>
       </w:pPr>
       <w:r>
         <w:rPr>
+          <w:rFonts w:ascii="Times New Roman" w:hAnsi="Times New Roman"/>
           <w:sz w:val="22"/>
         </w:rPr>
         <w:t>4.3 Trends</w:t>
@@ -882,7 +828,8 @@
     <w:p>
       <w:pPr>
         <w:spacing w:after="120"/>
-        <w:ind w:firstLine="0"/>
+        <w:ind w:firstLine="425"/>
+        <w:jc w:val="both"/>
       </w:pPr>
       <w:r>
         <w:rPr>
@@ -895,7 +842,8 @@
     <w:p>
       <w:pPr>
         <w:spacing w:after="120"/>
-        <w:ind w:firstLine="0"/>
+        <w:ind w:firstLine="425"/>
+        <w:jc w:val="both"/>
       </w:pPr>
       <w:r>
         <w:rPr>
@@ -908,7 +856,8 @@
     <w:p>
       <w:pPr>
         <w:spacing w:after="120"/>
-        <w:ind w:firstLine="0"/>
+        <w:ind w:firstLine="425"/>
+        <w:jc w:val="both"/>
       </w:pPr>
       <w:r>
         <w:rPr>
@@ -920,10 +869,13 @@
     </w:p>
     <w:p>
       <w:pPr>
-        <w:pStyle w:val="Heading2"/>
+        <w:spacing w:after="120"/>
+        <w:ind w:firstLine="425"/>
+        <w:jc w:val="both"/>
       </w:pPr>
       <w:r>
         <w:rPr>
+          <w:rFonts w:ascii="Times New Roman" w:hAnsi="Times New Roman"/>
           <w:sz w:val="22"/>
         </w:rPr>
         <w:t>4.4 Weak and emerging signals</w:t>
@@ -932,7 +884,8 @@
     <w:p>
       <w:pPr>
         <w:spacing w:after="120"/>
-        <w:ind w:firstLine="0"/>
+        <w:ind w:firstLine="425"/>
+        <w:jc w:val="both"/>
       </w:pPr>
       <w:r>
         <w:rPr>
@@ -945,7 +898,8 @@
     <w:p>
       <w:pPr>
         <w:spacing w:after="120"/>
-        <w:ind w:firstLine="0"/>
+        <w:ind w:firstLine="425"/>
+        <w:jc w:val="both"/>
       </w:pPr>
       <w:r>
         <w:rPr>
@@ -957,23 +911,26 @@
     </w:p>
     <w:p>
       <w:pPr>
-        <w:spacing w:after="80"/>
+        <w:spacing w:after="120"/>
+        <w:ind w:firstLine="425"/>
+        <w:jc w:val="both"/>
       </w:pPr>
       <w:r>
         <w:rPr>
           <w:rFonts w:ascii="Times New Roman" w:hAnsi="Times New Roman"/>
-          <w:i/>
-          <w:sz w:val="20"/>
+          <w:sz w:val="22"/>
         </w:rPr>
         <w:t>[Author note: Expand signal entries before submission. Add 2–3 concrete examples with source, date, and description as per the database template. Consider adding the geopolitical Arctic signal and the alternative protein signal as fully documented entries.]</w:t>
       </w:r>
     </w:p>
     <w:p>
       <w:pPr>
-        <w:pStyle w:val="Heading1"/>
+        <w:spacing w:before="320" w:after="120"/>
       </w:pPr>
       <w:r>
         <w:rPr>
+          <w:rFonts w:ascii="Times New Roman" w:hAnsi="Times New Roman"/>
+          <w:b/>
           <w:sz w:val="24"/>
         </w:rPr>
         <w:t>5. Discussion</w:t>
@@ -981,10 +938,13 @@
     </w:p>
     <w:p>
       <w:pPr>
-        <w:pStyle w:val="Heading2"/>
+        <w:spacing w:after="120"/>
+        <w:ind w:firstLine="425"/>
+        <w:jc w:val="both"/>
       </w:pPr>
       <w:r>
         <w:rPr>
+          <w:rFonts w:ascii="Times New Roman" w:hAnsi="Times New Roman"/>
           <w:sz w:val="22"/>
         </w:rPr>
         <w:t>5a. Interpretation of findings</w:t>
@@ -993,7 +953,8 @@
     <w:p>
       <w:pPr>
         <w:spacing w:after="120"/>
-        <w:ind w:firstLine="0"/>
+        <w:ind w:firstLine="425"/>
+        <w:jc w:val="both"/>
       </w:pPr>
       <w:r>
         <w:rPr>
@@ -1006,7 +967,8 @@
     <w:p>
       <w:pPr>
         <w:spacing w:after="120"/>
-        <w:ind w:firstLine="0"/>
+        <w:ind w:firstLine="425"/>
+        <w:jc w:val="both"/>
       </w:pPr>
       <w:r>
         <w:rPr>
@@ -1019,7 +981,8 @@
     <w:p>
       <w:pPr>
         <w:spacing w:after="120"/>
-        <w:ind w:firstLine="0"/>
+        <w:ind w:firstLine="425"/>
+        <w:jc w:val="both"/>
       </w:pPr>
       <w:r>
         <w:rPr>
@@ -1032,7 +995,8 @@
     <w:p>
       <w:pPr>
         <w:spacing w:after="120"/>
-        <w:ind w:firstLine="0"/>
+        <w:ind w:firstLine="425"/>
+        <w:jc w:val="both"/>
       </w:pPr>
       <w:r>
         <w:rPr>
@@ -1045,7 +1009,8 @@
     <w:p>
       <w:pPr>
         <w:spacing w:after="120"/>
-        <w:ind w:firstLine="0"/>
+        <w:ind w:firstLine="425"/>
+        <w:jc w:val="both"/>
       </w:pPr>
       <w:r>
         <w:rPr>
@@ -1057,10 +1022,13 @@
     </w:p>
     <w:p>
       <w:pPr>
-        <w:pStyle w:val="Heading2"/>
+        <w:spacing w:after="120"/>
+        <w:ind w:firstLine="425"/>
+        <w:jc w:val="both"/>
       </w:pPr>
       <w:r>
         <w:rPr>
+          <w:rFonts w:ascii="Times New Roman" w:hAnsi="Times New Roman"/>
           <w:sz w:val="22"/>
         </w:rPr>
         <w:t>5b. Implications for research, education, and policy</w:t>
@@ -1069,7 +1037,8 @@
     <w:p>
       <w:pPr>
         <w:spacing w:after="120"/>
-        <w:ind w:firstLine="0"/>
+        <w:ind w:firstLine="425"/>
+        <w:jc w:val="both"/>
       </w:pPr>
       <w:r>
         <w:rPr>
@@ -1082,7 +1051,8 @@
     <w:p>
       <w:pPr>
         <w:spacing w:after="120"/>
-        <w:ind w:firstLine="0"/>
+        <w:ind w:firstLine="425"/>
+        <w:jc w:val="both"/>
       </w:pPr>
       <w:r>
         <w:rPr>
@@ -1095,7 +1065,8 @@
     <w:p>
       <w:pPr>
         <w:spacing w:after="120"/>
-        <w:ind w:firstLine="0"/>
+        <w:ind w:firstLine="425"/>
+        <w:jc w:val="both"/>
       </w:pPr>
       <w:r>
         <w:rPr>
@@ -1107,10 +1078,13 @@
     </w:p>
     <w:p>
       <w:pPr>
-        <w:pStyle w:val="Heading2"/>
+        <w:spacing w:after="120"/>
+        <w:ind w:firstLine="425"/>
+        <w:jc w:val="both"/>
       </w:pPr>
       <w:r>
         <w:rPr>
+          <w:rFonts w:ascii="Times New Roman" w:hAnsi="Times New Roman"/>
           <w:sz w:val="22"/>
         </w:rPr>
         <w:t>5c. Limitations</w:t>
@@ -1119,7 +1093,8 @@
     <w:p>
       <w:pPr>
         <w:spacing w:after="120"/>
-        <w:ind w:firstLine="0"/>
+        <w:ind w:firstLine="425"/>
+        <w:jc w:val="both"/>
       </w:pPr>
       <w:r>
         <w:rPr>
@@ -1132,7 +1107,8 @@
     <w:p>
       <w:pPr>
         <w:spacing w:after="120"/>
-        <w:ind w:firstLine="0"/>
+        <w:ind w:firstLine="425"/>
+        <w:jc w:val="both"/>
       </w:pPr>
       <w:r>
         <w:rPr>
@@ -1144,10 +1120,12 @@
     </w:p>
     <w:p>
       <w:pPr>
-        <w:pStyle w:val="Heading1"/>
+        <w:spacing w:before="320" w:after="120"/>
       </w:pPr>
       <w:r>
         <w:rPr>
+          <w:rFonts w:ascii="Times New Roman" w:hAnsi="Times New Roman"/>
+          <w:b/>
           <w:sz w:val="24"/>
         </w:rPr>
         <w:t>6. Conclusions</w:t>
@@ -1156,7 +1134,8 @@
     <w:p>
       <w:pPr>
         <w:spacing w:after="120"/>
-        <w:ind w:firstLine="0"/>
+        <w:ind w:firstLine="425"/>
+        <w:jc w:val="both"/>
       </w:pPr>
       <w:r>
         <w:rPr>
@@ -1169,7 +1148,8 @@
     <w:p>
       <w:pPr>
         <w:spacing w:after="120"/>
-        <w:ind w:firstLine="0"/>
+        <w:ind w:firstLine="425"/>
+        <w:jc w:val="both"/>
       </w:pPr>
       <w:r>
         <w:rPr>
@@ -1182,7 +1162,8 @@
     <w:p>
       <w:pPr>
         <w:spacing w:after="120"/>
-        <w:ind w:firstLine="0"/>
+        <w:ind w:firstLine="425"/>
+        <w:jc w:val="both"/>
       </w:pPr>
       <w:r>
         <w:rPr>
@@ -1195,7 +1176,8 @@
     <w:p>
       <w:pPr>
         <w:spacing w:after="120"/>
-        <w:ind w:firstLine="0"/>
+        <w:ind w:firstLine="425"/>
+        <w:jc w:val="both"/>
       </w:pPr>
       <w:r>
         <w:rPr>
@@ -1205,6 +1187,12 @@
         <w:t>Future work should prioritise completion of full-text screening of the 720 candidate papers identified via the automated OpenAlex search, which will substantially expand the evidence base and may revise the gap analysis reported here. Expanding the signal database, developing inter-rater reliability protocols for the STEEP classification, and extending the search to non-English-language foresight literature — particularly from East and Southeast Asian research communities — represent further priorities. Ultimately, the findings presented here argue for a more deliberate and structured engagement between fisheries science and the broader futures studies field: one that draws on the full range of foresight methods and the full spectrum of megatrends, rather than the environmental framing that currently predominates.</w:t>
       </w:r>
     </w:p>
+    <w:sectPr>
+      <w:pgSz w:w="12240" w:h="15840"/>
+      <w:pgMar w:top="1417" w:right="1701" w:bottom="1417" w:left="1701" w:header="720" w:footer="720" w:gutter="0"/>
+      <w:cols w:space="720"/>
+      <w:docGrid w:linePitch="360"/>
+    </w:sectPr>
   </w:body>
 </w:document>
 </file>

</xml_diff>